<commit_message>
Apply review synthesis: Team 4 quick table, test stop criterion, tolerances
- Add a "Team 4 questions at a glance" table under Purpose
- Test 1 now requires the vehicle to stop before the obstacle (simple
  braking model), not just a zero speed command
- cmd_speed accepts 3.5-3.6 m/s and caps it, so rounding at full speed
  does not trigger a safe stop
- fbk_wheel_speed computed from time between pulses (pulse counting in a
  10 ms window reads 0 at low speed)
- Note that emergency_stop is TRUE at power-up by design
- Open item P3: whether Perception's sensors wire to the HIAS controller

Co-Authored-By: Claude Opus 5.5 <noreply@anthropic.com>
Claude-Session: https://claude.ai/code/session_01Y7EAPDmN4wiBZbKTHiXKe9
</commit_message>
<xml_diff>
--- a/milestone-1/HIAS_Milestone1.docx
+++ b/milestone-1/HIAS_Milestone1.docx
@@ -290,9 +290,814 @@
           <w:rFonts w:ascii="Calibri" w:cs="Calibri" w:eastAsia="Calibri" w:hAnsi="Calibri"/>
           <w:color w:val="1E293B"/>
         </w:rPr>
-        <w:t xml:space="preserve">HIAS sits in the actuation path (AVC → HIAS → motor and servo), so its override does not depend on any other team obeying it: AVC's commands only reach the wheels when HIAS lets them through. Section 6 answers the Team 4 questions from the assignment (hardware, microcontroller, connections, stop conditions, override, sensor loss).</w:t>
-      </w:r>
-    </w:p>
+        <w:t xml:space="preserve">HIAS sits in the actuation path (AVC → HIAS → motor and servo), so its override does not depend on any other team obeying it: AVC's commands only reach the wheels when HIAS lets them through.</w:t>
+      </w:r>
+    </w:p>
+    <w:p>
+      <w:pPr>
+        <w:spacing w:after="120" w:line="276"/>
+      </w:pPr>
+      <w:r>
+        <w:rPr>
+          <w:rFonts w:ascii="Calibri" w:cs="Calibri" w:eastAsia="Calibri" w:hAnsi="Calibri"/>
+          <w:b/>
+          <w:bCs/>
+          <w:color w:val="1E293B"/>
+        </w:rPr>
+        <w:t xml:space="preserve">Team 4 questions at a glance</w:t>
+      </w:r>
+      <w:r>
+        <w:rPr>
+          <w:rFonts w:ascii="Calibri" w:cs="Calibri" w:eastAsia="Calibri" w:hAnsi="Calibri"/>
+          <w:color w:val="1E293B"/>
+        </w:rPr>
+        <w:t xml:space="preserve"> (details in Section 6):</w:t>
+      </w:r>
+    </w:p>
+    <w:tbl>
+      <w:tblPr>
+        <w:tblW w:type="dxa" w:w="9360"/>
+        <w:tblBorders>
+          <w:top w:val="single" w:color="CBD5E1" w:sz="4"/>
+          <w:left w:val="single" w:color="CBD5E1" w:sz="4"/>
+          <w:bottom w:val="single" w:color="CBD5E1" w:sz="4"/>
+          <w:right w:val="single" w:color="CBD5E1" w:sz="4"/>
+          <w:insideH w:val="single" w:color="CBD5E1" w:sz="4"/>
+          <w:insideV w:val="single" w:color="CBD5E1" w:sz="4"/>
+        </w:tblBorders>
+        <w:tblLayout w:type="fixed"/>
+      </w:tblPr>
+      <w:tblGrid>
+        <w:gridCol w:w="3156"/>
+        <w:gridCol w:w="5043"/>
+        <w:gridCol w:w="1161"/>
+      </w:tblGrid>
+      <w:tr>
+        <w:trPr>
+          <w:tblHeader/>
+        </w:trPr>
+        <w:tc>
+          <w:tcPr>
+            <w:tcW w:type="dxa" w:w="3156"/>
+            <w:shd w:fill="E2E8F0" w:color="auto" w:val="clear"/>
+            <w:tcMar>
+              <w:top w:type="dxa" w:w="60"/>
+              <w:left w:type="dxa" w:w="90"/>
+              <w:bottom w:type="dxa" w:w="60"/>
+              <w:right w:type="dxa" w:w="90"/>
+            </w:tcMar>
+          </w:tcPr>
+          <w:p>
+            <w:pPr>
+              <w:spacing w:after="0" w:line="252"/>
+            </w:pPr>
+            <w:r>
+              <w:rPr>
+                <w:rFonts w:ascii="Calibri" w:cs="Calibri" w:eastAsia="Calibri" w:hAnsi="Calibri"/>
+                <w:b/>
+                <w:bCs/>
+                <w:color w:val="1E293B"/>
+                <w:sz w:val="18"/>
+                <w:szCs w:val="18"/>
+              </w:rPr>
+              <w:t xml:space="preserve">Question from the assignment</w:t>
+            </w:r>
+          </w:p>
+        </w:tc>
+        <w:tc>
+          <w:tcPr>
+            <w:tcW w:type="dxa" w:w="5043"/>
+            <w:shd w:fill="E2E8F0" w:color="auto" w:val="clear"/>
+            <w:tcMar>
+              <w:top w:type="dxa" w:w="60"/>
+              <w:left w:type="dxa" w:w="90"/>
+              <w:bottom w:type="dxa" w:w="60"/>
+              <w:right w:type="dxa" w:w="90"/>
+            </w:tcMar>
+          </w:tcPr>
+          <w:p>
+            <w:pPr>
+              <w:spacing w:after="0" w:line="252"/>
+            </w:pPr>
+            <w:r>
+              <w:rPr>
+                <w:rFonts w:ascii="Calibri" w:cs="Calibri" w:eastAsia="Calibri" w:hAnsi="Calibri"/>
+                <w:b/>
+                <w:bCs/>
+                <w:color w:val="1E293B"/>
+                <w:sz w:val="18"/>
+                <w:szCs w:val="18"/>
+              </w:rPr>
+              <w:t xml:space="preserve">Short answer</w:t>
+            </w:r>
+          </w:p>
+        </w:tc>
+        <w:tc>
+          <w:tcPr>
+            <w:tcW w:type="dxa" w:w="1161"/>
+            <w:shd w:fill="E2E8F0" w:color="auto" w:val="clear"/>
+            <w:tcMar>
+              <w:top w:type="dxa" w:w="60"/>
+              <w:left w:type="dxa" w:w="90"/>
+              <w:bottom w:type="dxa" w:w="60"/>
+              <w:right w:type="dxa" w:w="90"/>
+            </w:tcMar>
+          </w:tcPr>
+          <w:p>
+            <w:pPr>
+              <w:spacing w:after="0" w:line="252"/>
+            </w:pPr>
+            <w:r>
+              <w:rPr>
+                <w:rFonts w:ascii="Calibri" w:cs="Calibri" w:eastAsia="Calibri" w:hAnsi="Calibri"/>
+                <w:b/>
+                <w:bCs/>
+                <w:color w:val="1E293B"/>
+                <w:sz w:val="18"/>
+                <w:szCs w:val="18"/>
+              </w:rPr>
+              <w:t xml:space="preserve">Section</w:t>
+            </w:r>
+          </w:p>
+        </w:tc>
+      </w:tr>
+      <w:tr>
+        <w:trPr>
+          <w:cantSplit/>
+        </w:trPr>
+        <w:tc>
+          <w:tcPr>
+            <w:tcW w:type="dxa" w:w="3156"/>
+            <w:tcMar>
+              <w:top w:type="dxa" w:w="60"/>
+              <w:left w:type="dxa" w:w="90"/>
+              <w:bottom w:type="dxa" w:w="60"/>
+              <w:right w:type="dxa" w:w="90"/>
+            </w:tcMar>
+          </w:tcPr>
+          <w:p>
+            <w:pPr>
+              <w:spacing w:after="0" w:line="252"/>
+            </w:pPr>
+            <w:r>
+              <w:rPr>
+                <w:rFonts w:ascii="Calibri" w:cs="Calibri" w:eastAsia="Calibri" w:hAnsi="Calibri"/>
+                <w:color w:val="1E293B"/>
+                <w:sz w:val="18"/>
+                <w:szCs w:val="18"/>
+              </w:rPr>
+              <w:t xml:space="preserve">What vehicle hardware do we already have?</w:t>
+            </w:r>
+          </w:p>
+        </w:tc>
+        <w:tc>
+          <w:tcPr>
+            <w:tcW w:type="dxa" w:w="5043"/>
+            <w:tcMar>
+              <w:top w:type="dxa" w:w="60"/>
+              <w:left w:type="dxa" w:w="90"/>
+              <w:bottom w:type="dxa" w:w="60"/>
+              <w:right w:type="dxa" w:w="90"/>
+            </w:tcMar>
+          </w:tcPr>
+          <w:p>
+            <w:pPr>
+              <w:spacing w:after="0" w:line="252"/>
+            </w:pPr>
+            <w:r>
+              <w:rPr>
+                <w:rFonts w:ascii="Calibri" w:cs="Calibri" w:eastAsia="Calibri" w:hAnsi="Calibri"/>
+                <w:color w:val="1E293B"/>
+                <w:sz w:val="18"/>
+                <w:szCs w:val="18"/>
+              </w:rPr>
+              <w:t xml:space="preserve">Not chosen yet. The plan is a prebuilt RC car (ESC + drive motor + steering servo, 2S LiPo) with a remote control.</w:t>
+            </w:r>
+          </w:p>
+        </w:tc>
+        <w:tc>
+          <w:tcPr>
+            <w:tcW w:type="dxa" w:w="1161"/>
+            <w:tcMar>
+              <w:top w:type="dxa" w:w="60"/>
+              <w:left w:type="dxa" w:w="90"/>
+              <w:bottom w:type="dxa" w:w="60"/>
+              <w:right w:type="dxa" w:w="90"/>
+            </w:tcMar>
+          </w:tcPr>
+          <w:p>
+            <w:pPr>
+              <w:spacing w:after="0" w:line="252"/>
+            </w:pPr>
+            <w:r>
+              <w:rPr>
+                <w:rFonts w:ascii="Calibri" w:cs="Calibri" w:eastAsia="Calibri" w:hAnsi="Calibri"/>
+                <w:color w:val="1E293B"/>
+                <w:sz w:val="18"/>
+                <w:szCs w:val="18"/>
+              </w:rPr>
+              <w:t xml:space="preserve">6.1</w:t>
+            </w:r>
+          </w:p>
+        </w:tc>
+      </w:tr>
+      <w:tr>
+        <w:trPr>
+          <w:cantSplit/>
+        </w:trPr>
+        <w:tc>
+          <w:tcPr>
+            <w:tcW w:type="dxa" w:w="3156"/>
+            <w:tcMar>
+              <w:top w:type="dxa" w:w="60"/>
+              <w:left w:type="dxa" w:w="90"/>
+              <w:bottom w:type="dxa" w:w="60"/>
+              <w:right w:type="dxa" w:w="90"/>
+            </w:tcMar>
+          </w:tcPr>
+          <w:p>
+            <w:pPr>
+              <w:spacing w:after="0" w:line="252"/>
+            </w:pPr>
+            <w:r>
+              <w:rPr>
+                <w:rFonts w:ascii="Calibri" w:cs="Calibri" w:eastAsia="Calibri" w:hAnsi="Calibri"/>
+                <w:color w:val="1E293B"/>
+                <w:sz w:val="18"/>
+                <w:szCs w:val="18"/>
+              </w:rPr>
+              <w:t xml:space="preserve">What microcontroller will be used?</w:t>
+            </w:r>
+          </w:p>
+        </w:tc>
+        <w:tc>
+          <w:tcPr>
+            <w:tcW w:type="dxa" w:w="5043"/>
+            <w:tcMar>
+              <w:top w:type="dxa" w:w="60"/>
+              <w:left w:type="dxa" w:w="90"/>
+              <w:bottom w:type="dxa" w:w="60"/>
+              <w:right w:type="dxa" w:w="90"/>
+            </w:tcMar>
+          </w:tcPr>
+          <w:p>
+            <w:pPr>
+              <w:spacing w:after="0" w:line="252"/>
+            </w:pPr>
+            <w:r>
+              <w:rPr>
+                <w:rFonts w:ascii="Calibri" w:cs="Calibri" w:eastAsia="Calibri" w:hAnsi="Calibri"/>
+                <w:color w:val="1E293B"/>
+                <w:sz w:val="18"/>
+                <w:szCs w:val="18"/>
+              </w:rPr>
+              <w:t xml:space="preserve">Not decided. We recommend an ESP32 as the safety gate; a Raspberry Pi or laptop can run the heavier software.</w:t>
+            </w:r>
+          </w:p>
+        </w:tc>
+        <w:tc>
+          <w:tcPr>
+            <w:tcW w:type="dxa" w:w="1161"/>
+            <w:tcMar>
+              <w:top w:type="dxa" w:w="60"/>
+              <w:left w:type="dxa" w:w="90"/>
+              <w:bottom w:type="dxa" w:w="60"/>
+              <w:right w:type="dxa" w:w="90"/>
+            </w:tcMar>
+          </w:tcPr>
+          <w:p>
+            <w:pPr>
+              <w:spacing w:after="0" w:line="252"/>
+            </w:pPr>
+            <w:r>
+              <w:rPr>
+                <w:rFonts w:ascii="Calibri" w:cs="Calibri" w:eastAsia="Calibri" w:hAnsi="Calibri"/>
+                <w:color w:val="1E293B"/>
+                <w:sz w:val="18"/>
+                <w:szCs w:val="18"/>
+              </w:rPr>
+              <w:t xml:space="preserve">6.2</w:t>
+            </w:r>
+          </w:p>
+        </w:tc>
+      </w:tr>
+      <w:tr>
+        <w:trPr>
+          <w:cantSplit/>
+        </w:trPr>
+        <w:tc>
+          <w:tcPr>
+            <w:tcW w:type="dxa" w:w="3156"/>
+            <w:tcMar>
+              <w:top w:type="dxa" w:w="60"/>
+              <w:left w:type="dxa" w:w="90"/>
+              <w:bottom w:type="dxa" w:w="60"/>
+              <w:right w:type="dxa" w:w="90"/>
+            </w:tcMar>
+          </w:tcPr>
+          <w:p>
+            <w:pPr>
+              <w:spacing w:after="0" w:line="252"/>
+            </w:pPr>
+            <w:r>
+              <w:rPr>
+                <w:rFonts w:ascii="Calibri" w:cs="Calibri" w:eastAsia="Calibri" w:hAnsi="Calibri"/>
+                <w:color w:val="1E293B"/>
+                <w:sz w:val="18"/>
+                <w:szCs w:val="18"/>
+              </w:rPr>
+              <w:t xml:space="preserve">How might the motor connect?</w:t>
+            </w:r>
+          </w:p>
+        </w:tc>
+        <w:tc>
+          <w:tcPr>
+            <w:tcW w:type="dxa" w:w="5043"/>
+            <w:tcMar>
+              <w:top w:type="dxa" w:w="60"/>
+              <w:left w:type="dxa" w:w="90"/>
+              <w:bottom w:type="dxa" w:w="60"/>
+              <w:right w:type="dxa" w:w="90"/>
+            </w:tcMar>
+          </w:tcPr>
+          <w:p>
+            <w:pPr>
+              <w:spacing w:after="0" w:line="252"/>
+            </w:pPr>
+            <w:r>
+              <w:rPr>
+                <w:rFonts w:ascii="Calibri" w:cs="Calibri" w:eastAsia="Calibri" w:hAnsi="Calibri"/>
+                <w:color w:val="1E293B"/>
+                <w:sz w:val="18"/>
+                <w:szCs w:val="18"/>
+              </w:rPr>
+              <w:t xml:space="preserve">Microcontroller PWM pin → ESC → motor (50 Hz, 1.0–2.0 ms pulse)</w:t>
+            </w:r>
+          </w:p>
+        </w:tc>
+        <w:tc>
+          <w:tcPr>
+            <w:tcW w:type="dxa" w:w="1161"/>
+            <w:tcMar>
+              <w:top w:type="dxa" w:w="60"/>
+              <w:left w:type="dxa" w:w="90"/>
+              <w:bottom w:type="dxa" w:w="60"/>
+              <w:right w:type="dxa" w:w="90"/>
+            </w:tcMar>
+          </w:tcPr>
+          <w:p>
+            <w:pPr>
+              <w:spacing w:after="0" w:line="252"/>
+            </w:pPr>
+            <w:r>
+              <w:rPr>
+                <w:rFonts w:ascii="Calibri" w:cs="Calibri" w:eastAsia="Calibri" w:hAnsi="Calibri"/>
+                <w:color w:val="1E293B"/>
+                <w:sz w:val="18"/>
+                <w:szCs w:val="18"/>
+              </w:rPr>
+              <w:t xml:space="preserve">6.3</w:t>
+            </w:r>
+          </w:p>
+        </w:tc>
+      </w:tr>
+      <w:tr>
+        <w:trPr>
+          <w:cantSplit/>
+        </w:trPr>
+        <w:tc>
+          <w:tcPr>
+            <w:tcW w:type="dxa" w:w="3156"/>
+            <w:tcMar>
+              <w:top w:type="dxa" w:w="60"/>
+              <w:left w:type="dxa" w:w="90"/>
+              <w:bottom w:type="dxa" w:w="60"/>
+              <w:right w:type="dxa" w:w="90"/>
+            </w:tcMar>
+          </w:tcPr>
+          <w:p>
+            <w:pPr>
+              <w:spacing w:after="0" w:line="252"/>
+            </w:pPr>
+            <w:r>
+              <w:rPr>
+                <w:rFonts w:ascii="Calibri" w:cs="Calibri" w:eastAsia="Calibri" w:hAnsi="Calibri"/>
+                <w:color w:val="1E293B"/>
+                <w:sz w:val="18"/>
+                <w:szCs w:val="18"/>
+              </w:rPr>
+              <w:t xml:space="preserve">How might steering connect?</w:t>
+            </w:r>
+          </w:p>
+        </w:tc>
+        <w:tc>
+          <w:tcPr>
+            <w:tcW w:type="dxa" w:w="5043"/>
+            <w:tcMar>
+              <w:top w:type="dxa" w:w="60"/>
+              <w:left w:type="dxa" w:w="90"/>
+              <w:bottom w:type="dxa" w:w="60"/>
+              <w:right w:type="dxa" w:w="90"/>
+            </w:tcMar>
+          </w:tcPr>
+          <w:p>
+            <w:pPr>
+              <w:spacing w:after="0" w:line="252"/>
+            </w:pPr>
+            <w:r>
+              <w:rPr>
+                <w:rFonts w:ascii="Calibri" w:cs="Calibri" w:eastAsia="Calibri" w:hAnsi="Calibri"/>
+                <w:color w:val="1E293B"/>
+                <w:sz w:val="18"/>
+                <w:szCs w:val="18"/>
+              </w:rPr>
+              <w:t xml:space="preserve">Microcontroller PWM pin → steering servo, calibrated to ±0.436 rad</w:t>
+            </w:r>
+          </w:p>
+        </w:tc>
+        <w:tc>
+          <w:tcPr>
+            <w:tcW w:type="dxa" w:w="1161"/>
+            <w:tcMar>
+              <w:top w:type="dxa" w:w="60"/>
+              <w:left w:type="dxa" w:w="90"/>
+              <w:bottom w:type="dxa" w:w="60"/>
+              <w:right w:type="dxa" w:w="90"/>
+            </w:tcMar>
+          </w:tcPr>
+          <w:p>
+            <w:pPr>
+              <w:spacing w:after="0" w:line="252"/>
+            </w:pPr>
+            <w:r>
+              <w:rPr>
+                <w:rFonts w:ascii="Calibri" w:cs="Calibri" w:eastAsia="Calibri" w:hAnsi="Calibri"/>
+                <w:color w:val="1E293B"/>
+                <w:sz w:val="18"/>
+                <w:szCs w:val="18"/>
+              </w:rPr>
+              <w:t xml:space="preserve">6.4</w:t>
+            </w:r>
+          </w:p>
+        </w:tc>
+      </w:tr>
+      <w:tr>
+        <w:trPr>
+          <w:cantSplit/>
+        </w:trPr>
+        <w:tc>
+          <w:tcPr>
+            <w:tcW w:type="dxa" w:w="3156"/>
+            <w:tcMar>
+              <w:top w:type="dxa" w:w="60"/>
+              <w:left w:type="dxa" w:w="90"/>
+              <w:bottom w:type="dxa" w:w="60"/>
+              <w:right w:type="dxa" w:w="90"/>
+            </w:tcMar>
+          </w:tcPr>
+          <w:p>
+            <w:pPr>
+              <w:spacing w:after="0" w:line="252"/>
+            </w:pPr>
+            <w:r>
+              <w:rPr>
+                <w:rFonts w:ascii="Calibri" w:cs="Calibri" w:eastAsia="Calibri" w:hAnsi="Calibri"/>
+                <w:color w:val="1E293B"/>
+                <w:sz w:val="18"/>
+                <w:szCs w:val="18"/>
+              </w:rPr>
+              <w:t xml:space="preserve">What does the hardware need from Control?</w:t>
+            </w:r>
+          </w:p>
+        </w:tc>
+        <w:tc>
+          <w:tcPr>
+            <w:tcW w:type="dxa" w:w="5043"/>
+            <w:tcMar>
+              <w:top w:type="dxa" w:w="60"/>
+              <w:left w:type="dxa" w:w="90"/>
+              <w:bottom w:type="dxa" w:w="60"/>
+              <w:right w:type="dxa" w:w="90"/>
+            </w:tcMar>
+          </w:tcPr>
+          <w:p>
+            <w:pPr>
+              <w:spacing w:after="0" w:line="252"/>
+            </w:pPr>
+            <w:r>
+              <w:rPr>
+                <w:rFonts w:ascii="Consolas" w:cs="Consolas" w:eastAsia="Consolas" w:hAnsi="Consolas"/>
+                <w:color w:val="1E293B"/>
+                <w:sz w:val="16"/>
+                <w:szCs w:val="16"/>
+              </w:rPr>
+              <w:t xml:space="preserve">cmd_speed</w:t>
+            </w:r>
+            <w:r>
+              <w:rPr>
+                <w:rFonts w:ascii="Calibri" w:cs="Calibri" w:eastAsia="Calibri" w:hAnsi="Calibri"/>
+                <w:color w:val="1E293B"/>
+                <w:sz w:val="18"/>
+                <w:szCs w:val="18"/>
+              </w:rPr>
+              <w:t xml:space="preserve"> (m/s) and </w:t>
+            </w:r>
+            <w:r>
+              <w:rPr>
+                <w:rFonts w:ascii="Consolas" w:cs="Consolas" w:eastAsia="Consolas" w:hAnsi="Consolas"/>
+                <w:color w:val="1E293B"/>
+                <w:sz w:val="16"/>
+                <w:szCs w:val="16"/>
+              </w:rPr>
+              <w:t xml:space="preserve">cmd_steering_angle</w:t>
+            </w:r>
+            <w:r>
+              <w:rPr>
+                <w:rFonts w:ascii="Calibri" w:cs="Calibri" w:eastAsia="Calibri" w:hAnsi="Calibri"/>
+                <w:color w:val="1E293B"/>
+                <w:sz w:val="18"/>
+                <w:szCs w:val="18"/>
+              </w:rPr>
+              <w:t xml:space="preserve"> (rad) at 50 Hz, plus </w:t>
+            </w:r>
+            <w:r>
+              <w:rPr>
+                <w:rFonts w:ascii="Consolas" w:cs="Consolas" w:eastAsia="Consolas" w:hAnsi="Consolas"/>
+                <w:color w:val="1E293B"/>
+                <w:sz w:val="16"/>
+                <w:szCs w:val="16"/>
+              </w:rPr>
+              <w:t xml:space="preserve">avc_heartbeat</w:t>
+            </w:r>
+          </w:p>
+        </w:tc>
+        <w:tc>
+          <w:tcPr>
+            <w:tcW w:type="dxa" w:w="1161"/>
+            <w:tcMar>
+              <w:top w:type="dxa" w:w="60"/>
+              <w:left w:type="dxa" w:w="90"/>
+              <w:bottom w:type="dxa" w:w="60"/>
+              <w:right w:type="dxa" w:w="90"/>
+            </w:tcMar>
+          </w:tcPr>
+          <w:p>
+            <w:pPr>
+              <w:spacing w:after="0" w:line="252"/>
+            </w:pPr>
+            <w:r>
+              <w:rPr>
+                <w:rFonts w:ascii="Calibri" w:cs="Calibri" w:eastAsia="Calibri" w:hAnsi="Calibri"/>
+                <w:color w:val="1E293B"/>
+                <w:sz w:val="18"/>
+                <w:szCs w:val="18"/>
+              </w:rPr>
+              <w:t xml:space="preserve">6.5</w:t>
+            </w:r>
+          </w:p>
+        </w:tc>
+      </w:tr>
+      <w:tr>
+        <w:trPr>
+          <w:cantSplit/>
+        </w:trPr>
+        <w:tc>
+          <w:tcPr>
+            <w:tcW w:type="dxa" w:w="3156"/>
+            <w:tcMar>
+              <w:top w:type="dxa" w:w="60"/>
+              <w:left w:type="dxa" w:w="90"/>
+              <w:bottom w:type="dxa" w:w="60"/>
+              <w:right w:type="dxa" w:w="90"/>
+            </w:tcMar>
+          </w:tcPr>
+          <w:p>
+            <w:pPr>
+              <w:spacing w:after="0" w:line="252"/>
+            </w:pPr>
+            <w:r>
+              <w:rPr>
+                <w:rFonts w:ascii="Calibri" w:cs="Calibri" w:eastAsia="Calibri" w:hAnsi="Calibri"/>
+                <w:color w:val="1E293B"/>
+                <w:sz w:val="18"/>
+                <w:szCs w:val="18"/>
+              </w:rPr>
+              <w:t xml:space="preserve">What should cause the vehicle to stop?</w:t>
+            </w:r>
+          </w:p>
+        </w:tc>
+        <w:tc>
+          <w:tcPr>
+            <w:tcW w:type="dxa" w:w="5043"/>
+            <w:tcMar>
+              <w:top w:type="dxa" w:w="60"/>
+              <w:left w:type="dxa" w:w="90"/>
+              <w:bottom w:type="dxa" w:w="60"/>
+              <w:right w:type="dxa" w:w="90"/>
+            </w:tcMar>
+          </w:tcPr>
+          <w:p>
+            <w:pPr>
+              <w:spacing w:after="0" w:line="252"/>
+            </w:pPr>
+            <w:r>
+              <w:rPr>
+                <w:rFonts w:ascii="Calibri" w:cs="Calibri" w:eastAsia="Calibri" w:hAnsi="Calibri"/>
+                <w:color w:val="1E293B"/>
+                <w:sz w:val="18"/>
+                <w:szCs w:val="18"/>
+              </w:rPr>
+              <w:t xml:space="preserve">E-stop or remote link lost; TTC &lt; 1.5 s or distance &lt; 0.5 m; any lost or invalid input; low battery; sensor fault; overspeed</w:t>
+            </w:r>
+          </w:p>
+        </w:tc>
+        <w:tc>
+          <w:tcPr>
+            <w:tcW w:type="dxa" w:w="1161"/>
+            <w:tcMar>
+              <w:top w:type="dxa" w:w="60"/>
+              <w:left w:type="dxa" w:w="90"/>
+              <w:bottom w:type="dxa" w:w="60"/>
+              <w:right w:type="dxa" w:w="90"/>
+            </w:tcMar>
+          </w:tcPr>
+          <w:p>
+            <w:pPr>
+              <w:spacing w:after="0" w:line="252"/>
+            </w:pPr>
+            <w:r>
+              <w:rPr>
+                <w:rFonts w:ascii="Calibri" w:cs="Calibri" w:eastAsia="Calibri" w:hAnsi="Calibri"/>
+                <w:color w:val="1E293B"/>
+                <w:sz w:val="18"/>
+                <w:szCs w:val="18"/>
+              </w:rPr>
+              <w:t xml:space="preserve">6.6</w:t>
+            </w:r>
+          </w:p>
+        </w:tc>
+      </w:tr>
+      <w:tr>
+        <w:trPr>
+          <w:cantSplit/>
+        </w:trPr>
+        <w:tc>
+          <w:tcPr>
+            <w:tcW w:type="dxa" w:w="3156"/>
+            <w:tcMar>
+              <w:top w:type="dxa" w:w="60"/>
+              <w:left w:type="dxa" w:w="90"/>
+              <w:bottom w:type="dxa" w:w="60"/>
+              <w:right w:type="dxa" w:w="90"/>
+            </w:tcMar>
+          </w:tcPr>
+          <w:p>
+            <w:pPr>
+              <w:spacing w:after="0" w:line="252"/>
+            </w:pPr>
+            <w:r>
+              <w:rPr>
+                <w:rFonts w:ascii="Calibri" w:cs="Calibri" w:eastAsia="Calibri" w:hAnsi="Calibri"/>
+                <w:color w:val="1E293B"/>
+                <w:sz w:val="18"/>
+                <w:szCs w:val="18"/>
+              </w:rPr>
+              <w:t xml:space="preserve">How will the e-stop override normal operation?</w:t>
+            </w:r>
+          </w:p>
+        </w:tc>
+        <w:tc>
+          <w:tcPr>
+            <w:tcW w:type="dxa" w:w="5043"/>
+            <w:tcMar>
+              <w:top w:type="dxa" w:w="60"/>
+              <w:left w:type="dxa" w:w="90"/>
+              <w:bottom w:type="dxa" w:w="60"/>
+              <w:right w:type="dxa" w:w="90"/>
+            </w:tcMar>
+          </w:tcPr>
+          <w:p>
+            <w:pPr>
+              <w:spacing w:after="0" w:line="252"/>
+            </w:pPr>
+            <w:r>
+              <w:rPr>
+                <w:rFonts w:ascii="Calibri" w:cs="Calibri" w:eastAsia="Calibri" w:hAnsi="Calibri"/>
+                <w:color w:val="1E293B"/>
+                <w:sz w:val="18"/>
+                <w:szCs w:val="18"/>
+              </w:rPr>
+              <w:t xml:space="preserve">HIAS is the last stage before the motor and only passes AVC's commands in ACTIVE; a hardware kill switch backs it up</w:t>
+            </w:r>
+          </w:p>
+        </w:tc>
+        <w:tc>
+          <w:tcPr>
+            <w:tcW w:type="dxa" w:w="1161"/>
+            <w:tcMar>
+              <w:top w:type="dxa" w:w="60"/>
+              <w:left w:type="dxa" w:w="90"/>
+              <w:bottom w:type="dxa" w:w="60"/>
+              <w:right w:type="dxa" w:w="90"/>
+            </w:tcMar>
+          </w:tcPr>
+          <w:p>
+            <w:pPr>
+              <w:spacing w:after="0" w:line="252"/>
+            </w:pPr>
+            <w:r>
+              <w:rPr>
+                <w:rFonts w:ascii="Calibri" w:cs="Calibri" w:eastAsia="Calibri" w:hAnsi="Calibri"/>
+                <w:color w:val="1E293B"/>
+                <w:sz w:val="18"/>
+                <w:szCs w:val="18"/>
+              </w:rPr>
+              <w:t xml:space="preserve">6.7</w:t>
+            </w:r>
+          </w:p>
+        </w:tc>
+      </w:tr>
+      <w:tr>
+        <w:trPr>
+          <w:cantSplit/>
+        </w:trPr>
+        <w:tc>
+          <w:tcPr>
+            <w:tcW w:type="dxa" w:w="3156"/>
+            <w:tcMar>
+              <w:top w:type="dxa" w:w="60"/>
+              <w:left w:type="dxa" w:w="90"/>
+              <w:bottom w:type="dxa" w:w="60"/>
+              <w:right w:type="dxa" w:w="90"/>
+            </w:tcMar>
+          </w:tcPr>
+          <w:p>
+            <w:pPr>
+              <w:spacing w:after="0" w:line="252"/>
+            </w:pPr>
+            <w:r>
+              <w:rPr>
+                <w:rFonts w:ascii="Calibri" w:cs="Calibri" w:eastAsia="Calibri" w:hAnsi="Calibri"/>
+                <w:color w:val="1E293B"/>
+                <w:sz w:val="18"/>
+                <w:szCs w:val="18"/>
+              </w:rPr>
+              <w:t xml:space="preserve">What if sensor information is unavailable?</w:t>
+            </w:r>
+          </w:p>
+        </w:tc>
+        <w:tc>
+          <w:tcPr>
+            <w:tcW w:type="dxa" w:w="5043"/>
+            <w:tcMar>
+              <w:top w:type="dxa" w:w="60"/>
+              <w:left w:type="dxa" w:w="90"/>
+              <w:bottom w:type="dxa" w:w="60"/>
+              <w:right w:type="dxa" w:w="90"/>
+            </w:tcMar>
+          </w:tcPr>
+          <w:p>
+            <w:pPr>
+              <w:spacing w:after="0" w:line="252"/>
+            </w:pPr>
+            <w:r>
+              <w:rPr>
+                <w:rFonts w:ascii="Calibri" w:cs="Calibri" w:eastAsia="Calibri" w:hAnsi="Calibri"/>
+                <w:color w:val="1E293B"/>
+                <w:sz w:val="18"/>
+                <w:szCs w:val="18"/>
+              </w:rPr>
+              <w:t xml:space="preserve">Controlled stop (maximum braking if Perception's data is lost)</w:t>
+            </w:r>
+          </w:p>
+        </w:tc>
+        <w:tc>
+          <w:tcPr>
+            <w:tcW w:type="dxa" w:w="1161"/>
+            <w:tcMar>
+              <w:top w:type="dxa" w:w="60"/>
+              <w:left w:type="dxa" w:w="90"/>
+              <w:bottom w:type="dxa" w:w="60"/>
+              <w:right w:type="dxa" w:w="90"/>
+            </w:tcMar>
+          </w:tcPr>
+          <w:p>
+            <w:pPr>
+              <w:spacing w:after="0" w:line="252"/>
+            </w:pPr>
+            <w:r>
+              <w:rPr>
+                <w:rFonts w:ascii="Calibri" w:cs="Calibri" w:eastAsia="Calibri" w:hAnsi="Calibri"/>
+                <w:color w:val="1E293B"/>
+                <w:sz w:val="18"/>
+                <w:szCs w:val="18"/>
+              </w:rPr>
+              <w:t xml:space="preserve">6.8</w:t>
+            </w:r>
+          </w:p>
+        </w:tc>
+      </w:tr>
+    </w:tbl>
     <w:p>
       <w:pPr>
         <w:sectPr>
@@ -3863,7 +4668,7 @@
           <w:rFonts w:ascii="Calibri" w:cs="Calibri" w:eastAsia="Calibri" w:hAnsi="Calibri"/>
           <w:color w:val="1E293B"/>
         </w:rPr>
-        <w:t xml:space="preserve">Invalid: NaN, &lt; 0.0 m/s, &gt; 3.5 m/s, or stale (&gt; 60 ms)</w:t>
+        <w:t xml:space="preserve">Invalid: NaN, &lt; 0.0 m/s, &gt; 3.6 m/s, or stale (&gt; 60 ms). Values from 3.5 to 3.6 m/s are accepted and capped at 3.5 m/s, so rounding at full speed does not cause a stop.</w:t>
       </w:r>
     </w:p>
     <w:p>
@@ -5507,7 +6312,7 @@
           <w:rFonts w:ascii="Calibri" w:cs="Calibri" w:eastAsia="Calibri" w:hAnsi="Calibri"/>
           <w:color w:val="1E293B"/>
         </w:rPr>
-        <w:t xml:space="preserve">Description: Measured vehicle speed from a wheel-speed sensor (Hall-effect or optical; TBD, and a prebuilt RC car will probably need one added). It equals ground speed while the wheels are not slipping. HIAS is the single source of measured speed.</w:t>
+        <w:t xml:space="preserve">Description: Measured vehicle speed from a wheel-speed sensor (Hall-effect or optical; TBD, and a prebuilt RC car will probably need one added). It equals ground speed while the wheels are not slipping. HIAS is the single source of measured speed. HIAS computes it from the time between sensor pulses, because counting pulses in a 10 ms window would read 0 at low speed.</w:t>
       </w:r>
     </w:p>
     <w:p>
@@ -6092,7 +6897,23 @@
           <w:rFonts w:ascii="Calibri" w:cs="Calibri" w:eastAsia="Calibri" w:hAnsi="Calibri"/>
           <w:color w:val="1E293B"/>
         </w:rPr>
-        <w:t xml:space="preserve">Expected range: TRUE or FALSE. The power-up value is TRUE.</w:t>
+        <w:t xml:space="preserve">Expected range: TRUE or FALSE. The power-up value is TRUE, so AVC will see it at every power-up. That is intended: </w:t>
+      </w:r>
+      <w:r>
+        <w:rPr>
+          <w:rFonts w:ascii="Consolas" w:cs="Consolas" w:eastAsia="Consolas" w:hAnsi="Consolas"/>
+          <w:color w:val="1E293B"/>
+          <w:sz w:val="20"/>
+          <w:szCs w:val="20"/>
+        </w:rPr>
+        <w:t xml:space="preserve">safety_supervisory_state</w:t>
+      </w:r>
+      <w:r>
+        <w:rPr>
+          <w:rFonts w:ascii="Calibri" w:cs="Calibri" w:eastAsia="Calibri" w:hAnsi="Calibri"/>
+          <w:color w:val="1E293B"/>
+        </w:rPr>
+        <w:t xml:space="preserve"> = 0 tells AVC it is standby, not a hazard.</w:t>
       </w:r>
     </w:p>
     <w:p>
@@ -15374,6 +16195,32 @@
       <w:r>
         <w:rPr>
           <w:rFonts w:ascii="Calibri" w:cs="Calibri" w:eastAsia="Calibri" w:hAnsi="Calibri"/>
+          <w:b/>
+          <w:bCs/>
+          <w:color w:val="1E293B"/>
+        </w:rPr>
+        <w:t xml:space="preserve">The vehicle actually stops before reaching the obstacle.</w:t>
+      </w:r>
+      <w:r>
+        <w:rPr>
+          <w:rFonts w:ascii="Calibri" w:cs="Calibri" w:eastAsia="Calibri" w:hAnsi="Calibri"/>
+          <w:color w:val="1E293B"/>
+        </w:rPr>
+        <w:t xml:space="preserve"> The test model includes a simple vehicle model (speed limited by a braking rate, starting at 3 m/s²), and the gap left at standstill must be greater than 0, at every speed up to 3.5 m/s.</w:t>
+      </w:r>
+    </w:p>
+    <w:p>
+      <w:pPr>
+        <w:pStyle w:val="ListParagraph"/>
+        <w:numPr>
+          <w:ilvl w:val="0"/>
+          <w:numId w:val="22"/>
+        </w:numPr>
+        <w:spacing w:after="60" w:line="264"/>
+      </w:pPr>
+      <w:r>
+        <w:rPr>
+          <w:rFonts w:ascii="Calibri" w:cs="Calibri" w:eastAsia="Calibri" w:hAnsi="Calibri"/>
           <w:color w:val="1E293B"/>
         </w:rPr>
         <w:t xml:space="preserve">The state does not flip back and forth near the threshold. With TTC dithering ±0.1 s around 1.5 s there is at most one transition (the 1.5 s trigger and 3.0 s release give hysteresis).</w:t>
@@ -19296,11 +20143,11 @@
         <w:tblLayout w:type="fixed"/>
       </w:tblPr>
       <w:tblGrid>
-        <w:gridCol w:w="518"/>
-        <w:gridCol w:w="3460"/>
-        <w:gridCol w:w="1269"/>
-        <w:gridCol w:w="1517"/>
-        <w:gridCol w:w="2596"/>
+        <w:gridCol w:w="517"/>
+        <w:gridCol w:w="3467"/>
+        <w:gridCol w:w="1265"/>
+        <w:gridCol w:w="1514"/>
+        <w:gridCol w:w="2597"/>
       </w:tblGrid>
       <w:tr>
         <w:trPr>
@@ -19308,7 +20155,7 @@
         </w:trPr>
         <w:tc>
           <w:tcPr>
-            <w:tcW w:type="dxa" w:w="518"/>
+            <w:tcW w:type="dxa" w:w="517"/>
             <w:shd w:fill="E2E8F0" w:color="auto" w:val="clear"/>
             <w:tcMar>
               <w:top w:type="dxa" w:w="60"/>
@@ -19336,7 +20183,7 @@
         </w:tc>
         <w:tc>
           <w:tcPr>
-            <w:tcW w:type="dxa" w:w="3460"/>
+            <w:tcW w:type="dxa" w:w="3467"/>
             <w:shd w:fill="E2E8F0" w:color="auto" w:val="clear"/>
             <w:tcMar>
               <w:top w:type="dxa" w:w="60"/>
@@ -19364,7 +20211,7 @@
         </w:tc>
         <w:tc>
           <w:tcPr>
-            <w:tcW w:type="dxa" w:w="1269"/>
+            <w:tcW w:type="dxa" w:w="1265"/>
             <w:shd w:fill="E2E8F0" w:color="auto" w:val="clear"/>
             <w:tcMar>
               <w:top w:type="dxa" w:w="60"/>
@@ -19392,7 +20239,7 @@
         </w:tc>
         <w:tc>
           <w:tcPr>
-            <w:tcW w:type="dxa" w:w="1517"/>
+            <w:tcW w:type="dxa" w:w="1514"/>
             <w:shd w:fill="E2E8F0" w:color="auto" w:val="clear"/>
             <w:tcMar>
               <w:top w:type="dxa" w:w="60"/>
@@ -19420,7 +20267,7 @@
         </w:tc>
         <w:tc>
           <w:tcPr>
-            <w:tcW w:type="dxa" w:w="2596"/>
+            <w:tcW w:type="dxa" w:w="2597"/>
             <w:shd w:fill="E2E8F0" w:color="auto" w:val="clear"/>
             <w:tcMar>
               <w:top w:type="dxa" w:w="60"/>
@@ -19453,7 +20300,7 @@
         </w:trPr>
         <w:tc>
           <w:tcPr>
-            <w:tcW w:type="dxa" w:w="518"/>
+            <w:tcW w:type="dxa" w:w="517"/>
             <w:tcMar>
               <w:top w:type="dxa" w:w="60"/>
               <w:left w:type="dxa" w:w="90"/>
@@ -19478,7 +20325,7 @@
         </w:tc>
         <w:tc>
           <w:tcPr>
-            <w:tcW w:type="dxa" w:w="3460"/>
+            <w:tcW w:type="dxa" w:w="3467"/>
             <w:tcMar>
               <w:top w:type="dxa" w:w="60"/>
               <w:left w:type="dxa" w:w="90"/>
@@ -19521,7 +20368,7 @@
         </w:tc>
         <w:tc>
           <w:tcPr>
-            <w:tcW w:type="dxa" w:w="1269"/>
+            <w:tcW w:type="dxa" w:w="1265"/>
             <w:tcMar>
               <w:top w:type="dxa" w:w="60"/>
               <w:left w:type="dxa" w:w="90"/>
@@ -19546,7 +20393,7 @@
         </w:tc>
         <w:tc>
           <w:tcPr>
-            <w:tcW w:type="dxa" w:w="1517"/>
+            <w:tcW w:type="dxa" w:w="1514"/>
             <w:tcMar>
               <w:top w:type="dxa" w:w="60"/>
               <w:left w:type="dxa" w:w="90"/>
@@ -19571,7 +20418,7 @@
         </w:tc>
         <w:tc>
           <w:tcPr>
-            <w:tcW w:type="dxa" w:w="2596"/>
+            <w:tcW w:type="dxa" w:w="2597"/>
             <w:tcMar>
               <w:top w:type="dxa" w:w="60"/>
               <w:left w:type="dxa" w:w="90"/>
@@ -19601,7 +20448,7 @@
         </w:trPr>
         <w:tc>
           <w:tcPr>
-            <w:tcW w:type="dxa" w:w="518"/>
+            <w:tcW w:type="dxa" w:w="517"/>
             <w:tcMar>
               <w:top w:type="dxa" w:w="60"/>
               <w:left w:type="dxa" w:w="90"/>
@@ -19626,7 +20473,7 @@
         </w:tc>
         <w:tc>
           <w:tcPr>
-            <w:tcW w:type="dxa" w:w="3460"/>
+            <w:tcW w:type="dxa" w:w="3467"/>
             <w:tcMar>
               <w:top w:type="dxa" w:w="60"/>
               <w:left w:type="dxa" w:w="90"/>
@@ -19759,7 +20606,7 @@
         </w:tc>
         <w:tc>
           <w:tcPr>
-            <w:tcW w:type="dxa" w:w="1269"/>
+            <w:tcW w:type="dxa" w:w="1265"/>
             <w:tcMar>
               <w:top w:type="dxa" w:w="60"/>
               <w:left w:type="dxa" w:w="90"/>
@@ -19784,7 +20631,7 @@
         </w:tc>
         <w:tc>
           <w:tcPr>
-            <w:tcW w:type="dxa" w:w="1517"/>
+            <w:tcW w:type="dxa" w:w="1514"/>
             <w:tcMar>
               <w:top w:type="dxa" w:w="60"/>
               <w:left w:type="dxa" w:w="90"/>
@@ -19809,7 +20656,7 @@
         </w:tc>
         <w:tc>
           <w:tcPr>
-            <w:tcW w:type="dxa" w:w="2596"/>
+            <w:tcW w:type="dxa" w:w="2597"/>
             <w:tcMar>
               <w:top w:type="dxa" w:w="60"/>
               <w:left w:type="dxa" w:w="90"/>
@@ -19875,7 +20722,7 @@
         </w:trPr>
         <w:tc>
           <w:tcPr>
-            <w:tcW w:type="dxa" w:w="518"/>
+            <w:tcW w:type="dxa" w:w="517"/>
             <w:tcMar>
               <w:top w:type="dxa" w:w="60"/>
               <w:left w:type="dxa" w:w="90"/>
@@ -19900,7 +20747,7 @@
         </w:tc>
         <w:tc>
           <w:tcPr>
-            <w:tcW w:type="dxa" w:w="3460"/>
+            <w:tcW w:type="dxa" w:w="3467"/>
             <w:tcMar>
               <w:top w:type="dxa" w:w="60"/>
               <w:left w:type="dxa" w:w="90"/>
@@ -19945,7 +20792,7 @@
         </w:tc>
         <w:tc>
           <w:tcPr>
-            <w:tcW w:type="dxa" w:w="1269"/>
+            <w:tcW w:type="dxa" w:w="1265"/>
             <w:tcMar>
               <w:top w:type="dxa" w:w="60"/>
               <w:left w:type="dxa" w:w="90"/>
@@ -19970,7 +20817,7 @@
         </w:tc>
         <w:tc>
           <w:tcPr>
-            <w:tcW w:type="dxa" w:w="1517"/>
+            <w:tcW w:type="dxa" w:w="1514"/>
             <w:tcMar>
               <w:top w:type="dxa" w:w="60"/>
               <w:left w:type="dxa" w:w="90"/>
@@ -19995,7 +20842,7 @@
         </w:tc>
         <w:tc>
           <w:tcPr>
-            <w:tcW w:type="dxa" w:w="2596"/>
+            <w:tcW w:type="dxa" w:w="2597"/>
             <w:tcMar>
               <w:top w:type="dxa" w:w="60"/>
               <w:left w:type="dxa" w:w="90"/>
@@ -20025,7 +20872,7 @@
         </w:trPr>
         <w:tc>
           <w:tcPr>
-            <w:tcW w:type="dxa" w:w="518"/>
+            <w:tcW w:type="dxa" w:w="517"/>
             <w:tcMar>
               <w:top w:type="dxa" w:w="60"/>
               <w:left w:type="dxa" w:w="90"/>
@@ -20050,7 +20897,7 @@
         </w:tc>
         <w:tc>
           <w:tcPr>
-            <w:tcW w:type="dxa" w:w="3460"/>
+            <w:tcW w:type="dxa" w:w="3467"/>
             <w:tcMar>
               <w:top w:type="dxa" w:w="60"/>
               <w:left w:type="dxa" w:w="90"/>
@@ -20111,7 +20958,7 @@
         </w:tc>
         <w:tc>
           <w:tcPr>
-            <w:tcW w:type="dxa" w:w="1269"/>
+            <w:tcW w:type="dxa" w:w="1265"/>
             <w:tcMar>
               <w:top w:type="dxa" w:w="60"/>
               <w:left w:type="dxa" w:w="90"/>
@@ -20136,7 +20983,7 @@
         </w:tc>
         <w:tc>
           <w:tcPr>
-            <w:tcW w:type="dxa" w:w="1517"/>
+            <w:tcW w:type="dxa" w:w="1514"/>
             <w:tcMar>
               <w:top w:type="dxa" w:w="60"/>
               <w:left w:type="dxa" w:w="90"/>
@@ -20161,7 +21008,7 @@
         </w:tc>
         <w:tc>
           <w:tcPr>
-            <w:tcW w:type="dxa" w:w="2596"/>
+            <w:tcW w:type="dxa" w:w="2597"/>
             <w:tcMar>
               <w:top w:type="dxa" w:w="60"/>
               <w:left w:type="dxa" w:w="90"/>
@@ -20191,7 +21038,7 @@
         </w:trPr>
         <w:tc>
           <w:tcPr>
-            <w:tcW w:type="dxa" w:w="518"/>
+            <w:tcW w:type="dxa" w:w="517"/>
             <w:tcMar>
               <w:top w:type="dxa" w:w="60"/>
               <w:left w:type="dxa" w:w="90"/>
@@ -20216,7 +21063,7 @@
         </w:tc>
         <w:tc>
           <w:tcPr>
-            <w:tcW w:type="dxa" w:w="3460"/>
+            <w:tcW w:type="dxa" w:w="3467"/>
             <w:tcMar>
               <w:top w:type="dxa" w:w="60"/>
               <w:left w:type="dxa" w:w="90"/>
@@ -20277,7 +21124,7 @@
         </w:tc>
         <w:tc>
           <w:tcPr>
-            <w:tcW w:type="dxa" w:w="1269"/>
+            <w:tcW w:type="dxa" w:w="1265"/>
             <w:tcMar>
               <w:top w:type="dxa" w:w="60"/>
               <w:left w:type="dxa" w:w="90"/>
@@ -20302,7 +21149,7 @@
         </w:tc>
         <w:tc>
           <w:tcPr>
-            <w:tcW w:type="dxa" w:w="1517"/>
+            <w:tcW w:type="dxa" w:w="1514"/>
             <w:tcMar>
               <w:top w:type="dxa" w:w="60"/>
               <w:left w:type="dxa" w:w="90"/>
@@ -20327,7 +21174,7 @@
         </w:tc>
         <w:tc>
           <w:tcPr>
-            <w:tcW w:type="dxa" w:w="2596"/>
+            <w:tcW w:type="dxa" w:w="2597"/>
             <w:tcMar>
               <w:top w:type="dxa" w:w="60"/>
               <w:left w:type="dxa" w:w="90"/>
@@ -20357,7 +21204,7 @@
         </w:trPr>
         <w:tc>
           <w:tcPr>
-            <w:tcW w:type="dxa" w:w="518"/>
+            <w:tcW w:type="dxa" w:w="517"/>
             <w:tcMar>
               <w:top w:type="dxa" w:w="60"/>
               <w:left w:type="dxa" w:w="90"/>
@@ -20382,7 +21229,7 @@
         </w:tc>
         <w:tc>
           <w:tcPr>
-            <w:tcW w:type="dxa" w:w="3460"/>
+            <w:tcW w:type="dxa" w:w="3467"/>
             <w:tcMar>
               <w:top w:type="dxa" w:w="60"/>
               <w:left w:type="dxa" w:w="90"/>
@@ -20434,7 +21281,7 @@
         </w:tc>
         <w:tc>
           <w:tcPr>
-            <w:tcW w:type="dxa" w:w="1269"/>
+            <w:tcW w:type="dxa" w:w="1265"/>
             <w:tcMar>
               <w:top w:type="dxa" w:w="60"/>
               <w:left w:type="dxa" w:w="90"/>
@@ -20459,7 +21306,7 @@
         </w:tc>
         <w:tc>
           <w:tcPr>
-            <w:tcW w:type="dxa" w:w="1517"/>
+            <w:tcW w:type="dxa" w:w="1514"/>
             <w:tcMar>
               <w:top w:type="dxa" w:w="60"/>
               <w:left w:type="dxa" w:w="90"/>
@@ -20484,7 +21331,7 @@
         </w:tc>
         <w:tc>
           <w:tcPr>
-            <w:tcW w:type="dxa" w:w="2596"/>
+            <w:tcW w:type="dxa" w:w="2597"/>
             <w:tcMar>
               <w:top w:type="dxa" w:w="60"/>
               <w:left w:type="dxa" w:w="90"/>
@@ -20514,7 +21361,7 @@
         </w:trPr>
         <w:tc>
           <w:tcPr>
-            <w:tcW w:type="dxa" w:w="518"/>
+            <w:tcW w:type="dxa" w:w="517"/>
             <w:tcMar>
               <w:top w:type="dxa" w:w="60"/>
               <w:left w:type="dxa" w:w="90"/>
@@ -20539,7 +21386,7 @@
         </w:tc>
         <w:tc>
           <w:tcPr>
-            <w:tcW w:type="dxa" w:w="3460"/>
+            <w:tcW w:type="dxa" w:w="3467"/>
             <w:tcMar>
               <w:top w:type="dxa" w:w="60"/>
               <w:left w:type="dxa" w:w="90"/>
@@ -20564,7 +21411,7 @@
         </w:tc>
         <w:tc>
           <w:tcPr>
-            <w:tcW w:type="dxa" w:w="1269"/>
+            <w:tcW w:type="dxa" w:w="1265"/>
             <w:tcMar>
               <w:top w:type="dxa" w:w="60"/>
               <w:left w:type="dxa" w:w="90"/>
@@ -20589,7 +21436,7 @@
         </w:tc>
         <w:tc>
           <w:tcPr>
-            <w:tcW w:type="dxa" w:w="1517"/>
+            <w:tcW w:type="dxa" w:w="1514"/>
             <w:tcMar>
               <w:top w:type="dxa" w:w="60"/>
               <w:left w:type="dxa" w:w="90"/>
@@ -20614,7 +21461,7 @@
         </w:tc>
         <w:tc>
           <w:tcPr>
-            <w:tcW w:type="dxa" w:w="2596"/>
+            <w:tcW w:type="dxa" w:w="2597"/>
             <w:tcMar>
               <w:top w:type="dxa" w:w="60"/>
               <w:left w:type="dxa" w:w="90"/>
@@ -20644,126 +21491,126 @@
         </w:trPr>
         <w:tc>
           <w:tcPr>
-            <w:tcW w:type="dxa" w:w="518"/>
-            <w:tcMar>
-              <w:top w:type="dxa" w:w="60"/>
-              <w:left w:type="dxa" w:w="90"/>
-              <w:bottom w:type="dxa" w:w="60"/>
-              <w:right w:type="dxa" w:w="90"/>
-            </w:tcMar>
-          </w:tcPr>
-          <w:p>
-            <w:pPr>
-              <w:spacing w:after="0" w:line="252"/>
-            </w:pPr>
-            <w:r>
-              <w:rPr>
-                <w:rFonts w:ascii="Calibri" w:cs="Calibri" w:eastAsia="Calibri" w:hAnsi="Calibri"/>
-                <w:color w:val="1E293B"/>
-                <w:sz w:val="18"/>
-                <w:szCs w:val="18"/>
-              </w:rPr>
-              <w:t xml:space="preserve">M1</w:t>
-            </w:r>
-          </w:p>
-        </w:tc>
-        <w:tc>
-          <w:tcPr>
-            <w:tcW w:type="dxa" w:w="3460"/>
-            <w:tcMar>
-              <w:top w:type="dxa" w:w="60"/>
-              <w:left w:type="dxa" w:w="90"/>
-              <w:bottom w:type="dxa" w:w="60"/>
-              <w:right w:type="dxa" w:w="90"/>
-            </w:tcMar>
-          </w:tcPr>
-          <w:p>
-            <w:pPr>
-              <w:spacing w:after="0" w:line="252"/>
-            </w:pPr>
-            <w:r>
-              <w:rPr>
-                <w:rFonts w:ascii="Calibri" w:cs="Calibri" w:eastAsia="Calibri" w:hAnsi="Calibri"/>
-                <w:color w:val="1E293B"/>
-                <w:sz w:val="18"/>
-                <w:szCs w:val="18"/>
-              </w:rPr>
-              <w:t xml:space="preserve">Motion Planning's cycle rate and heartbeat</w:t>
-            </w:r>
-          </w:p>
-        </w:tc>
-        <w:tc>
-          <w:tcPr>
-            <w:tcW w:type="dxa" w:w="1269"/>
-            <w:tcMar>
-              <w:top w:type="dxa" w:w="60"/>
-              <w:left w:type="dxa" w:w="90"/>
-              <w:bottom w:type="dxa" w:w="60"/>
-              <w:right w:type="dxa" w:w="90"/>
-            </w:tcMar>
-          </w:tcPr>
-          <w:p>
-            <w:pPr>
-              <w:spacing w:after="0" w:line="252"/>
-            </w:pPr>
-            <w:r>
-              <w:rPr>
-                <w:rFonts w:ascii="Calibri" w:cs="Calibri" w:eastAsia="Calibri" w:hAnsi="Calibri"/>
-                <w:color w:val="1E293B"/>
-                <w:sz w:val="18"/>
-                <w:szCs w:val="18"/>
-              </w:rPr>
-              <w:t xml:space="preserve">Jessica</w:t>
-            </w:r>
-          </w:p>
-        </w:tc>
-        <w:tc>
-          <w:tcPr>
-            <w:tcW w:type="dxa" w:w="1517"/>
-            <w:tcMar>
-              <w:top w:type="dxa" w:w="60"/>
-              <w:left w:type="dxa" w:w="90"/>
-              <w:bottom w:type="dxa" w:w="60"/>
-              <w:right w:type="dxa" w:w="90"/>
-            </w:tcMar>
-          </w:tcPr>
-          <w:p>
-            <w:pPr>
-              <w:spacing w:after="0" w:line="252"/>
-            </w:pPr>
-            <w:r>
-              <w:rPr>
-                <w:rFonts w:ascii="Calibri" w:cs="Calibri" w:eastAsia="Calibri" w:hAnsi="Calibri"/>
-                <w:color w:val="1E293B"/>
-                <w:sz w:val="18"/>
-                <w:szCs w:val="18"/>
-              </w:rPr>
-              <w:t xml:space="preserve">Motion Planning</w:t>
-            </w:r>
-          </w:p>
-        </w:tc>
-        <w:tc>
-          <w:tcPr>
-            <w:tcW w:type="dxa" w:w="2596"/>
-            <w:tcMar>
-              <w:top w:type="dxa" w:w="60"/>
-              <w:left w:type="dxa" w:w="90"/>
-              <w:bottom w:type="dxa" w:w="60"/>
-              <w:right w:type="dxa" w:w="90"/>
-            </w:tcMar>
-          </w:tcPr>
-          <w:p>
-            <w:pPr>
-              <w:spacing w:after="0" w:line="252"/>
-            </w:pPr>
-            <w:r>
-              <w:rPr>
-                <w:rFonts w:ascii="Calibri" w:cs="Calibri" w:eastAsia="Calibri" w:hAnsi="Calibri"/>
-                <w:color w:val="1E293B"/>
-                <w:sz w:val="18"/>
-                <w:szCs w:val="18"/>
-              </w:rPr>
-              <w:t xml:space="preserve">20 Hz, timeout 150 ms</w:t>
+            <w:tcW w:type="dxa" w:w="517"/>
+            <w:tcMar>
+              <w:top w:type="dxa" w:w="60"/>
+              <w:left w:type="dxa" w:w="90"/>
+              <w:bottom w:type="dxa" w:w="60"/>
+              <w:right w:type="dxa" w:w="90"/>
+            </w:tcMar>
+          </w:tcPr>
+          <w:p>
+            <w:pPr>
+              <w:spacing w:after="0" w:line="252"/>
+            </w:pPr>
+            <w:r>
+              <w:rPr>
+                <w:rFonts w:ascii="Calibri" w:cs="Calibri" w:eastAsia="Calibri" w:hAnsi="Calibri"/>
+                <w:color w:val="1E293B"/>
+                <w:sz w:val="18"/>
+                <w:szCs w:val="18"/>
+              </w:rPr>
+              <w:t xml:space="preserve">P3</w:t>
+            </w:r>
+          </w:p>
+        </w:tc>
+        <w:tc>
+          <w:tcPr>
+            <w:tcW w:type="dxa" w:w="3467"/>
+            <w:tcMar>
+              <w:top w:type="dxa" w:w="60"/>
+              <w:left w:type="dxa" w:w="90"/>
+              <w:bottom w:type="dxa" w:w="60"/>
+              <w:right w:type="dxa" w:w="90"/>
+            </w:tcMar>
+          </w:tcPr>
+          <w:p>
+            <w:pPr>
+              <w:spacing w:after="0" w:line="252"/>
+            </w:pPr>
+            <w:r>
+              <w:rPr>
+                <w:rFonts w:ascii="Calibri" w:cs="Calibri" w:eastAsia="Calibri" w:hAnsi="Calibri"/>
+                <w:color w:val="1E293B"/>
+                <w:sz w:val="18"/>
+                <w:szCs w:val="18"/>
+              </w:rPr>
+              <w:t xml:space="preserve">Are Perception's sensors (e.g. an ultrasonic sensor) wired to their own board or to the HIAS microcontroller on the car?</w:t>
+            </w:r>
+          </w:p>
+        </w:tc>
+        <w:tc>
+          <w:tcPr>
+            <w:tcW w:type="dxa" w:w="1265"/>
+            <w:tcMar>
+              <w:top w:type="dxa" w:w="60"/>
+              <w:left w:type="dxa" w:w="90"/>
+              <w:bottom w:type="dxa" w:w="60"/>
+              <w:right w:type="dxa" w:w="90"/>
+            </w:tcMar>
+          </w:tcPr>
+          <w:p>
+            <w:pPr>
+              <w:spacing w:after="0" w:line="252"/>
+            </w:pPr>
+            <w:r>
+              <w:rPr>
+                <w:rFonts w:ascii="Calibri" w:cs="Calibri" w:eastAsia="Calibri" w:hAnsi="Calibri"/>
+                <w:color w:val="1E293B"/>
+                <w:sz w:val="18"/>
+                <w:szCs w:val="18"/>
+              </w:rPr>
+              <w:t xml:space="preserve">Colin</w:t>
+            </w:r>
+          </w:p>
+        </w:tc>
+        <w:tc>
+          <w:tcPr>
+            <w:tcW w:type="dxa" w:w="1514"/>
+            <w:tcMar>
+              <w:top w:type="dxa" w:w="60"/>
+              <w:left w:type="dxa" w:w="90"/>
+              <w:bottom w:type="dxa" w:w="60"/>
+              <w:right w:type="dxa" w:w="90"/>
+            </w:tcMar>
+          </w:tcPr>
+          <w:p>
+            <w:pPr>
+              <w:spacing w:after="0" w:line="252"/>
+            </w:pPr>
+            <w:r>
+              <w:rPr>
+                <w:rFonts w:ascii="Calibri" w:cs="Calibri" w:eastAsia="Calibri" w:hAnsi="Calibri"/>
+                <w:color w:val="1E293B"/>
+                <w:sz w:val="18"/>
+                <w:szCs w:val="18"/>
+              </w:rPr>
+              <w:t xml:space="preserve">Perception</w:t>
+            </w:r>
+          </w:p>
+        </w:tc>
+        <w:tc>
+          <w:tcPr>
+            <w:tcW w:type="dxa" w:w="2597"/>
+            <w:tcMar>
+              <w:top w:type="dxa" w:w="60"/>
+              <w:left w:type="dxa" w:w="90"/>
+              <w:bottom w:type="dxa" w:w="60"/>
+              <w:right w:type="dxa" w:w="90"/>
+            </w:tcMar>
+          </w:tcPr>
+          <w:p>
+            <w:pPr>
+              <w:spacing w:after="0" w:line="252"/>
+            </w:pPr>
+            <w:r>
+              <w:rPr>
+                <w:rFonts w:ascii="Calibri" w:cs="Calibri" w:eastAsia="Calibri" w:hAnsi="Calibri"/>
+                <w:color w:val="1E293B"/>
+                <w:sz w:val="18"/>
+                <w:szCs w:val="18"/>
+              </w:rPr>
+              <w:t xml:space="preserve">If they're wired to ours, HIAS adds a raw-reading signal to Perception</w:t>
             </w:r>
           </w:p>
         </w:tc>
@@ -20774,126 +21621,126 @@
         </w:trPr>
         <w:tc>
           <w:tcPr>
-            <w:tcW w:type="dxa" w:w="518"/>
-            <w:tcMar>
-              <w:top w:type="dxa" w:w="60"/>
-              <w:left w:type="dxa" w:w="90"/>
-              <w:bottom w:type="dxa" w:w="60"/>
-              <w:right w:type="dxa" w:w="90"/>
-            </w:tcMar>
-          </w:tcPr>
-          <w:p>
-            <w:pPr>
-              <w:spacing w:after="0" w:line="252"/>
-            </w:pPr>
-            <w:r>
-              <w:rPr>
-                <w:rFonts w:ascii="Calibri" w:cs="Calibri" w:eastAsia="Calibri" w:hAnsi="Calibri"/>
-                <w:color w:val="1E293B"/>
-                <w:sz w:val="18"/>
-                <w:szCs w:val="18"/>
-              </w:rPr>
-              <w:t xml:space="preserve">S1</w:t>
-            </w:r>
-          </w:p>
-        </w:tc>
-        <w:tc>
-          <w:tcPr>
-            <w:tcW w:type="dxa" w:w="3460"/>
-            <w:tcMar>
-              <w:top w:type="dxa" w:w="60"/>
-              <w:left w:type="dxa" w:w="90"/>
-              <w:bottom w:type="dxa" w:w="60"/>
-              <w:right w:type="dxa" w:w="90"/>
-            </w:tcMar>
-          </w:tcPr>
-          <w:p>
-            <w:pPr>
-              <w:spacing w:after="0" w:line="252"/>
-            </w:pPr>
-            <w:r>
-              <w:rPr>
-                <w:rFonts w:ascii="Calibri" w:cs="Calibri" w:eastAsia="Calibri" w:hAnsi="Calibri"/>
-                <w:color w:val="1E293B"/>
-                <w:sz w:val="18"/>
-                <w:szCs w:val="18"/>
-              </w:rPr>
-              <w:t xml:space="preserve">AEB thresholds (TTC 1.5 s / 3.0 s, distance 0.5 m / 1.0 m)</w:t>
-            </w:r>
-          </w:p>
-        </w:tc>
-        <w:tc>
-          <w:tcPr>
-            <w:tcW w:type="dxa" w:w="1269"/>
-            <w:tcMar>
-              <w:top w:type="dxa" w:w="60"/>
-              <w:left w:type="dxa" w:w="90"/>
-              <w:bottom w:type="dxa" w:w="60"/>
-              <w:right w:type="dxa" w:w="90"/>
-            </w:tcMar>
-          </w:tcPr>
-          <w:p>
-            <w:pPr>
-              <w:spacing w:after="0" w:line="252"/>
-            </w:pPr>
-            <w:r>
-              <w:rPr>
-                <w:rFonts w:ascii="Calibri" w:cs="Calibri" w:eastAsia="Calibri" w:hAnsi="Calibri"/>
-                <w:color w:val="1E293B"/>
-                <w:sz w:val="18"/>
-                <w:szCs w:val="18"/>
-              </w:rPr>
-              <w:t xml:space="preserve">Stephen</w:t>
-            </w:r>
-          </w:p>
-        </w:tc>
-        <w:tc>
-          <w:tcPr>
-            <w:tcW w:type="dxa" w:w="1517"/>
-            <w:tcMar>
-              <w:top w:type="dxa" w:w="60"/>
-              <w:left w:type="dxa" w:w="90"/>
-              <w:bottom w:type="dxa" w:w="60"/>
-              <w:right w:type="dxa" w:w="90"/>
-            </w:tcMar>
-          </w:tcPr>
-          <w:p>
-            <w:pPr>
-              <w:spacing w:after="0" w:line="252"/>
-            </w:pPr>
-            <w:r>
-              <w:rPr>
-                <w:rFonts w:ascii="Calibri" w:cs="Calibri" w:eastAsia="Calibri" w:hAnsi="Calibri"/>
-                <w:color w:val="1E293B"/>
-                <w:sz w:val="18"/>
-                <w:szCs w:val="18"/>
-              </w:rPr>
-              <w:t xml:space="preserve">Test 1</w:t>
-            </w:r>
-          </w:p>
-        </w:tc>
-        <w:tc>
-          <w:tcPr>
-            <w:tcW w:type="dxa" w:w="2596"/>
-            <w:tcMar>
-              <w:top w:type="dxa" w:w="60"/>
-              <w:left w:type="dxa" w:w="90"/>
-              <w:bottom w:type="dxa" w:w="60"/>
-              <w:right w:type="dxa" w:w="90"/>
-            </w:tcMar>
-          </w:tcPr>
-          <w:p>
-            <w:pPr>
-              <w:spacing w:after="0" w:line="252"/>
-            </w:pPr>
-            <w:r>
-              <w:rPr>
-                <w:rFonts w:ascii="Calibri" w:cs="Calibri" w:eastAsia="Calibri" w:hAnsi="Calibri"/>
-                <w:color w:val="1E293B"/>
-                <w:sz w:val="18"/>
-                <w:szCs w:val="18"/>
-              </w:rPr>
-              <w:t xml:space="preserve">Starting values above</w:t>
+            <w:tcW w:type="dxa" w:w="517"/>
+            <w:tcMar>
+              <w:top w:type="dxa" w:w="60"/>
+              <w:left w:type="dxa" w:w="90"/>
+              <w:bottom w:type="dxa" w:w="60"/>
+              <w:right w:type="dxa" w:w="90"/>
+            </w:tcMar>
+          </w:tcPr>
+          <w:p>
+            <w:pPr>
+              <w:spacing w:after="0" w:line="252"/>
+            </w:pPr>
+            <w:r>
+              <w:rPr>
+                <w:rFonts w:ascii="Calibri" w:cs="Calibri" w:eastAsia="Calibri" w:hAnsi="Calibri"/>
+                <w:color w:val="1E293B"/>
+                <w:sz w:val="18"/>
+                <w:szCs w:val="18"/>
+              </w:rPr>
+              <w:t xml:space="preserve">M1</w:t>
+            </w:r>
+          </w:p>
+        </w:tc>
+        <w:tc>
+          <w:tcPr>
+            <w:tcW w:type="dxa" w:w="3467"/>
+            <w:tcMar>
+              <w:top w:type="dxa" w:w="60"/>
+              <w:left w:type="dxa" w:w="90"/>
+              <w:bottom w:type="dxa" w:w="60"/>
+              <w:right w:type="dxa" w:w="90"/>
+            </w:tcMar>
+          </w:tcPr>
+          <w:p>
+            <w:pPr>
+              <w:spacing w:after="0" w:line="252"/>
+            </w:pPr>
+            <w:r>
+              <w:rPr>
+                <w:rFonts w:ascii="Calibri" w:cs="Calibri" w:eastAsia="Calibri" w:hAnsi="Calibri"/>
+                <w:color w:val="1E293B"/>
+                <w:sz w:val="18"/>
+                <w:szCs w:val="18"/>
+              </w:rPr>
+              <w:t xml:space="preserve">Motion Planning's cycle rate and heartbeat</w:t>
+            </w:r>
+          </w:p>
+        </w:tc>
+        <w:tc>
+          <w:tcPr>
+            <w:tcW w:type="dxa" w:w="1265"/>
+            <w:tcMar>
+              <w:top w:type="dxa" w:w="60"/>
+              <w:left w:type="dxa" w:w="90"/>
+              <w:bottom w:type="dxa" w:w="60"/>
+              <w:right w:type="dxa" w:w="90"/>
+            </w:tcMar>
+          </w:tcPr>
+          <w:p>
+            <w:pPr>
+              <w:spacing w:after="0" w:line="252"/>
+            </w:pPr>
+            <w:r>
+              <w:rPr>
+                <w:rFonts w:ascii="Calibri" w:cs="Calibri" w:eastAsia="Calibri" w:hAnsi="Calibri"/>
+                <w:color w:val="1E293B"/>
+                <w:sz w:val="18"/>
+                <w:szCs w:val="18"/>
+              </w:rPr>
+              <w:t xml:space="preserve">Jessica</w:t>
+            </w:r>
+          </w:p>
+        </w:tc>
+        <w:tc>
+          <w:tcPr>
+            <w:tcW w:type="dxa" w:w="1514"/>
+            <w:tcMar>
+              <w:top w:type="dxa" w:w="60"/>
+              <w:left w:type="dxa" w:w="90"/>
+              <w:bottom w:type="dxa" w:w="60"/>
+              <w:right w:type="dxa" w:w="90"/>
+            </w:tcMar>
+          </w:tcPr>
+          <w:p>
+            <w:pPr>
+              <w:spacing w:after="0" w:line="252"/>
+            </w:pPr>
+            <w:r>
+              <w:rPr>
+                <w:rFonts w:ascii="Calibri" w:cs="Calibri" w:eastAsia="Calibri" w:hAnsi="Calibri"/>
+                <w:color w:val="1E293B"/>
+                <w:sz w:val="18"/>
+                <w:szCs w:val="18"/>
+              </w:rPr>
+              <w:t xml:space="preserve">Motion Planning</w:t>
+            </w:r>
+          </w:p>
+        </w:tc>
+        <w:tc>
+          <w:tcPr>
+            <w:tcW w:type="dxa" w:w="2597"/>
+            <w:tcMar>
+              <w:top w:type="dxa" w:w="60"/>
+              <w:left w:type="dxa" w:w="90"/>
+              <w:bottom w:type="dxa" w:w="60"/>
+              <w:right w:type="dxa" w:w="90"/>
+            </w:tcMar>
+          </w:tcPr>
+          <w:p>
+            <w:pPr>
+              <w:spacing w:after="0" w:line="252"/>
+            </w:pPr>
+            <w:r>
+              <w:rPr>
+                <w:rFonts w:ascii="Calibri" w:cs="Calibri" w:eastAsia="Calibri" w:hAnsi="Calibri"/>
+                <w:color w:val="1E293B"/>
+                <w:sz w:val="18"/>
+                <w:szCs w:val="18"/>
+              </w:rPr>
+              <w:t xml:space="preserve">20 Hz, timeout 150 ms</w:t>
             </w:r>
           </w:p>
         </w:tc>
@@ -20904,57 +21751,57 @@
         </w:trPr>
         <w:tc>
           <w:tcPr>
-            <w:tcW w:type="dxa" w:w="518"/>
-            <w:tcMar>
-              <w:top w:type="dxa" w:w="60"/>
-              <w:left w:type="dxa" w:w="90"/>
-              <w:bottom w:type="dxa" w:w="60"/>
-              <w:right w:type="dxa" w:w="90"/>
-            </w:tcMar>
-          </w:tcPr>
-          <w:p>
-            <w:pPr>
-              <w:spacing w:after="0" w:line="252"/>
-            </w:pPr>
-            <w:r>
-              <w:rPr>
-                <w:rFonts w:ascii="Calibri" w:cs="Calibri" w:eastAsia="Calibri" w:hAnsi="Calibri"/>
-                <w:color w:val="1E293B"/>
-                <w:sz w:val="18"/>
-                <w:szCs w:val="18"/>
-              </w:rPr>
-              <w:t xml:space="preserve">S2</w:t>
-            </w:r>
-          </w:p>
-        </w:tc>
-        <w:tc>
-          <w:tcPr>
-            <w:tcW w:type="dxa" w:w="3460"/>
-            <w:tcMar>
-              <w:top w:type="dxa" w:w="60"/>
-              <w:left w:type="dxa" w:w="90"/>
-              <w:bottom w:type="dxa" w:w="60"/>
-              <w:right w:type="dxa" w:w="90"/>
-            </w:tcMar>
-          </w:tcPr>
-          <w:p>
-            <w:pPr>
-              <w:spacing w:after="0" w:line="252"/>
-            </w:pPr>
-            <w:r>
-              <w:rPr>
-                <w:rFonts w:ascii="Calibri" w:cs="Calibri" w:eastAsia="Calibri" w:hAnsi="Calibri"/>
-                <w:color w:val="1E293B"/>
-                <w:sz w:val="18"/>
-                <w:szCs w:val="18"/>
-              </w:rPr>
-              <w:t xml:space="preserve">Does AEB need a manual reset?</w:t>
-            </w:r>
-          </w:p>
-        </w:tc>
-        <w:tc>
-          <w:tcPr>
-            <w:tcW w:type="dxa" w:w="1269"/>
+            <w:tcW w:type="dxa" w:w="517"/>
+            <w:tcMar>
+              <w:top w:type="dxa" w:w="60"/>
+              <w:left w:type="dxa" w:w="90"/>
+              <w:bottom w:type="dxa" w:w="60"/>
+              <w:right w:type="dxa" w:w="90"/>
+            </w:tcMar>
+          </w:tcPr>
+          <w:p>
+            <w:pPr>
+              <w:spacing w:after="0" w:line="252"/>
+            </w:pPr>
+            <w:r>
+              <w:rPr>
+                <w:rFonts w:ascii="Calibri" w:cs="Calibri" w:eastAsia="Calibri" w:hAnsi="Calibri"/>
+                <w:color w:val="1E293B"/>
+                <w:sz w:val="18"/>
+                <w:szCs w:val="18"/>
+              </w:rPr>
+              <w:t xml:space="preserve">S1</w:t>
+            </w:r>
+          </w:p>
+        </w:tc>
+        <w:tc>
+          <w:tcPr>
+            <w:tcW w:type="dxa" w:w="3467"/>
+            <w:tcMar>
+              <w:top w:type="dxa" w:w="60"/>
+              <w:left w:type="dxa" w:w="90"/>
+              <w:bottom w:type="dxa" w:w="60"/>
+              <w:right w:type="dxa" w:w="90"/>
+            </w:tcMar>
+          </w:tcPr>
+          <w:p>
+            <w:pPr>
+              <w:spacing w:after="0" w:line="252"/>
+            </w:pPr>
+            <w:r>
+              <w:rPr>
+                <w:rFonts w:ascii="Calibri" w:cs="Calibri" w:eastAsia="Calibri" w:hAnsi="Calibri"/>
+                <w:color w:val="1E293B"/>
+                <w:sz w:val="18"/>
+                <w:szCs w:val="18"/>
+              </w:rPr>
+              <w:t xml:space="preserve">AEB thresholds (TTC 1.5 s / 3.0 s, distance 0.5 m / 1.0 m)</w:t>
+            </w:r>
+          </w:p>
+        </w:tc>
+        <w:tc>
+          <w:tcPr>
+            <w:tcW w:type="dxa" w:w="1265"/>
             <w:tcMar>
               <w:top w:type="dxa" w:w="60"/>
               <w:left w:type="dxa" w:w="90"/>
@@ -20979,51 +21826,51 @@
         </w:tc>
         <w:tc>
           <w:tcPr>
-            <w:tcW w:type="dxa" w:w="1517"/>
-            <w:tcMar>
-              <w:top w:type="dxa" w:w="60"/>
-              <w:left w:type="dxa" w:w="90"/>
-              <w:bottom w:type="dxa" w:w="60"/>
-              <w:right w:type="dxa" w:w="90"/>
-            </w:tcMar>
-          </w:tcPr>
-          <w:p>
-            <w:pPr>
-              <w:spacing w:after="0" w:line="252"/>
-            </w:pPr>
-            <w:r>
-              <w:rPr>
-                <w:rFonts w:ascii="Calibri" w:cs="Calibri" w:eastAsia="Calibri" w:hAnsi="Calibri"/>
-                <w:color w:val="1E293B"/>
-                <w:sz w:val="18"/>
-                <w:szCs w:val="18"/>
-              </w:rPr>
-              <w:t xml:space="preserve">HIAS team</w:t>
-            </w:r>
-          </w:p>
-        </w:tc>
-        <w:tc>
-          <w:tcPr>
-            <w:tcW w:type="dxa" w:w="2596"/>
-            <w:tcMar>
-              <w:top w:type="dxa" w:w="60"/>
-              <w:left w:type="dxa" w:w="90"/>
-              <w:bottom w:type="dxa" w:w="60"/>
-              <w:right w:type="dxa" w:w="90"/>
-            </w:tcMar>
-          </w:tcPr>
-          <w:p>
-            <w:pPr>
-              <w:spacing w:after="0" w:line="252"/>
-            </w:pPr>
-            <w:r>
-              <w:rPr>
-                <w:rFonts w:ascii="Calibri" w:cs="Calibri" w:eastAsia="Calibri" w:hAnsi="Calibri"/>
-                <w:color w:val="1E293B"/>
-                <w:sz w:val="18"/>
-                <w:szCs w:val="18"/>
-              </w:rPr>
-              <w:t xml:space="preserve">No separate reset switch, but the car never drives off on its own; the operator must re-arm</w:t>
+            <w:tcW w:type="dxa" w:w="1514"/>
+            <w:tcMar>
+              <w:top w:type="dxa" w:w="60"/>
+              <w:left w:type="dxa" w:w="90"/>
+              <w:bottom w:type="dxa" w:w="60"/>
+              <w:right w:type="dxa" w:w="90"/>
+            </w:tcMar>
+          </w:tcPr>
+          <w:p>
+            <w:pPr>
+              <w:spacing w:after="0" w:line="252"/>
+            </w:pPr>
+            <w:r>
+              <w:rPr>
+                <w:rFonts w:ascii="Calibri" w:cs="Calibri" w:eastAsia="Calibri" w:hAnsi="Calibri"/>
+                <w:color w:val="1E293B"/>
+                <w:sz w:val="18"/>
+                <w:szCs w:val="18"/>
+              </w:rPr>
+              <w:t xml:space="preserve">Test 1</w:t>
+            </w:r>
+          </w:p>
+        </w:tc>
+        <w:tc>
+          <w:tcPr>
+            <w:tcW w:type="dxa" w:w="2597"/>
+            <w:tcMar>
+              <w:top w:type="dxa" w:w="60"/>
+              <w:left w:type="dxa" w:w="90"/>
+              <w:bottom w:type="dxa" w:w="60"/>
+              <w:right w:type="dxa" w:w="90"/>
+            </w:tcMar>
+          </w:tcPr>
+          <w:p>
+            <w:pPr>
+              <w:spacing w:after="0" w:line="252"/>
+            </w:pPr>
+            <w:r>
+              <w:rPr>
+                <w:rFonts w:ascii="Calibri" w:cs="Calibri" w:eastAsia="Calibri" w:hAnsi="Calibri"/>
+                <w:color w:val="1E293B"/>
+                <w:sz w:val="18"/>
+                <w:szCs w:val="18"/>
+              </w:rPr>
+              <w:t xml:space="preserve">Starting values above</w:t>
             </w:r>
           </w:p>
         </w:tc>
@@ -21034,57 +21881,57 @@
         </w:trPr>
         <w:tc>
           <w:tcPr>
-            <w:tcW w:type="dxa" w:w="518"/>
-            <w:tcMar>
-              <w:top w:type="dxa" w:w="60"/>
-              <w:left w:type="dxa" w:w="90"/>
-              <w:bottom w:type="dxa" w:w="60"/>
-              <w:right w:type="dxa" w:w="90"/>
-            </w:tcMar>
-          </w:tcPr>
-          <w:p>
-            <w:pPr>
-              <w:spacing w:after="0" w:line="252"/>
-            </w:pPr>
-            <w:r>
-              <w:rPr>
-                <w:rFonts w:ascii="Calibri" w:cs="Calibri" w:eastAsia="Calibri" w:hAnsi="Calibri"/>
-                <w:color w:val="1E293B"/>
-                <w:sz w:val="18"/>
-                <w:szCs w:val="18"/>
-              </w:rPr>
-              <w:t xml:space="preserve">S3</w:t>
-            </w:r>
-          </w:p>
-        </w:tc>
-        <w:tc>
-          <w:tcPr>
-            <w:tcW w:type="dxa" w:w="3460"/>
-            <w:tcMar>
-              <w:top w:type="dxa" w:w="60"/>
-              <w:left w:type="dxa" w:w="90"/>
-              <w:bottom w:type="dxa" w:w="60"/>
-              <w:right w:type="dxa" w:w="90"/>
-            </w:tcMar>
-          </w:tcPr>
-          <w:p>
-            <w:pPr>
-              <w:spacing w:after="0" w:line="252"/>
-            </w:pPr>
-            <w:r>
-              <w:rPr>
-                <w:rFonts w:ascii="Calibri" w:cs="Calibri" w:eastAsia="Calibri" w:hAnsi="Calibri"/>
-                <w:color w:val="1E293B"/>
-                <w:sz w:val="18"/>
-                <w:szCs w:val="18"/>
-              </w:rPr>
-              <w:t xml:space="preserve">Steering during a stop: follow AVC, hold, or straighten?</w:t>
-            </w:r>
-          </w:p>
-        </w:tc>
-        <w:tc>
-          <w:tcPr>
-            <w:tcW w:type="dxa" w:w="1269"/>
+            <w:tcW w:type="dxa" w:w="517"/>
+            <w:tcMar>
+              <w:top w:type="dxa" w:w="60"/>
+              <w:left w:type="dxa" w:w="90"/>
+              <w:bottom w:type="dxa" w:w="60"/>
+              <w:right w:type="dxa" w:w="90"/>
+            </w:tcMar>
+          </w:tcPr>
+          <w:p>
+            <w:pPr>
+              <w:spacing w:after="0" w:line="252"/>
+            </w:pPr>
+            <w:r>
+              <w:rPr>
+                <w:rFonts w:ascii="Calibri" w:cs="Calibri" w:eastAsia="Calibri" w:hAnsi="Calibri"/>
+                <w:color w:val="1E293B"/>
+                <w:sz w:val="18"/>
+                <w:szCs w:val="18"/>
+              </w:rPr>
+              <w:t xml:space="preserve">S2</w:t>
+            </w:r>
+          </w:p>
+        </w:tc>
+        <w:tc>
+          <w:tcPr>
+            <w:tcW w:type="dxa" w:w="3467"/>
+            <w:tcMar>
+              <w:top w:type="dxa" w:w="60"/>
+              <w:left w:type="dxa" w:w="90"/>
+              <w:bottom w:type="dxa" w:w="60"/>
+              <w:right w:type="dxa" w:w="90"/>
+            </w:tcMar>
+          </w:tcPr>
+          <w:p>
+            <w:pPr>
+              <w:spacing w:after="0" w:line="252"/>
+            </w:pPr>
+            <w:r>
+              <w:rPr>
+                <w:rFonts w:ascii="Calibri" w:cs="Calibri" w:eastAsia="Calibri" w:hAnsi="Calibri"/>
+                <w:color w:val="1E293B"/>
+                <w:sz w:val="18"/>
+                <w:szCs w:val="18"/>
+              </w:rPr>
+              <w:t xml:space="preserve">Does AEB need a manual reset?</w:t>
+            </w:r>
+          </w:p>
+        </w:tc>
+        <w:tc>
+          <w:tcPr>
+            <w:tcW w:type="dxa" w:w="1265"/>
             <w:tcMar>
               <w:top w:type="dxa" w:w="60"/>
               <w:left w:type="dxa" w:w="90"/>
@@ -21109,51 +21956,51 @@
         </w:tc>
         <w:tc>
           <w:tcPr>
-            <w:tcW w:type="dxa" w:w="1517"/>
-            <w:tcMar>
-              <w:top w:type="dxa" w:w="60"/>
-              <w:left w:type="dxa" w:w="90"/>
-              <w:bottom w:type="dxa" w:w="60"/>
-              <w:right w:type="dxa" w:w="90"/>
-            </w:tcMar>
-          </w:tcPr>
-          <w:p>
-            <w:pPr>
-              <w:spacing w:after="0" w:line="252"/>
-            </w:pPr>
-            <w:r>
-              <w:rPr>
-                <w:rFonts w:ascii="Calibri" w:cs="Calibri" w:eastAsia="Calibri" w:hAnsi="Calibri"/>
-                <w:color w:val="1E293B"/>
-                <w:sz w:val="18"/>
-                <w:szCs w:val="18"/>
-              </w:rPr>
-              <w:t xml:space="preserve">HIAS team, AVC</w:t>
-            </w:r>
-          </w:p>
-        </w:tc>
-        <w:tc>
-          <w:tcPr>
-            <w:tcW w:type="dxa" w:w="2596"/>
-            <w:tcMar>
-              <w:top w:type="dxa" w:w="60"/>
-              <w:left w:type="dxa" w:w="90"/>
-              <w:bottom w:type="dxa" w:w="60"/>
-              <w:right w:type="dxa" w:w="90"/>
-            </w:tcMar>
-          </w:tcPr>
-          <w:p>
-            <w:pPr>
-              <w:spacing w:after="0" w:line="252"/>
-            </w:pPr>
-            <w:r>
-              <w:rPr>
-                <w:rFonts w:ascii="Calibri" w:cs="Calibri" w:eastAsia="Calibri" w:hAnsi="Calibri"/>
-                <w:color w:val="1E293B"/>
-                <w:sz w:val="18"/>
-                <w:szCs w:val="18"/>
-              </w:rPr>
-              <w:t xml:space="preserve">Follow AVC if valid, else straighten</w:t>
+            <w:tcW w:type="dxa" w:w="1514"/>
+            <w:tcMar>
+              <w:top w:type="dxa" w:w="60"/>
+              <w:left w:type="dxa" w:w="90"/>
+              <w:bottom w:type="dxa" w:w="60"/>
+              <w:right w:type="dxa" w:w="90"/>
+            </w:tcMar>
+          </w:tcPr>
+          <w:p>
+            <w:pPr>
+              <w:spacing w:after="0" w:line="252"/>
+            </w:pPr>
+            <w:r>
+              <w:rPr>
+                <w:rFonts w:ascii="Calibri" w:cs="Calibri" w:eastAsia="Calibri" w:hAnsi="Calibri"/>
+                <w:color w:val="1E293B"/>
+                <w:sz w:val="18"/>
+                <w:szCs w:val="18"/>
+              </w:rPr>
+              <w:t xml:space="preserve">HIAS team</w:t>
+            </w:r>
+          </w:p>
+        </w:tc>
+        <w:tc>
+          <w:tcPr>
+            <w:tcW w:type="dxa" w:w="2597"/>
+            <w:tcMar>
+              <w:top w:type="dxa" w:w="60"/>
+              <w:left w:type="dxa" w:w="90"/>
+              <w:bottom w:type="dxa" w:w="60"/>
+              <w:right w:type="dxa" w:w="90"/>
+            </w:tcMar>
+          </w:tcPr>
+          <w:p>
+            <w:pPr>
+              <w:spacing w:after="0" w:line="252"/>
+            </w:pPr>
+            <w:r>
+              <w:rPr>
+                <w:rFonts w:ascii="Calibri" w:cs="Calibri" w:eastAsia="Calibri" w:hAnsi="Calibri"/>
+                <w:color w:val="1E293B"/>
+                <w:sz w:val="18"/>
+                <w:szCs w:val="18"/>
+              </w:rPr>
+              <w:t xml:space="preserve">No separate reset switch, but the car never drives off on its own; the operator must re-arm</w:t>
             </w:r>
           </w:p>
         </w:tc>
@@ -21164,126 +22011,126 @@
         </w:trPr>
         <w:tc>
           <w:tcPr>
-            <w:tcW w:type="dxa" w:w="518"/>
-            <w:tcMar>
-              <w:top w:type="dxa" w:w="60"/>
-              <w:left w:type="dxa" w:w="90"/>
-              <w:bottom w:type="dxa" w:w="60"/>
-              <w:right w:type="dxa" w:w="90"/>
-            </w:tcMar>
-          </w:tcPr>
-          <w:p>
-            <w:pPr>
-              <w:spacing w:after="0" w:line="252"/>
-            </w:pPr>
-            <w:r>
-              <w:rPr>
-                <w:rFonts w:ascii="Calibri" w:cs="Calibri" w:eastAsia="Calibri" w:hAnsi="Calibri"/>
-                <w:color w:val="1E293B"/>
-                <w:sz w:val="18"/>
-                <w:szCs w:val="18"/>
-              </w:rPr>
-              <w:t xml:space="preserve">S4</w:t>
-            </w:r>
-          </w:p>
-        </w:tc>
-        <w:tc>
-          <w:tcPr>
-            <w:tcW w:type="dxa" w:w="3460"/>
-            <w:tcMar>
-              <w:top w:type="dxa" w:w="60"/>
-              <w:left w:type="dxa" w:w="90"/>
-              <w:bottom w:type="dxa" w:w="60"/>
-              <w:right w:type="dxa" w:w="90"/>
-            </w:tcMar>
-          </w:tcPr>
-          <w:p>
-            <w:pPr>
-              <w:spacing w:after="0" w:line="252"/>
-            </w:pPr>
-            <w:r>
-              <w:rPr>
-                <w:rFonts w:ascii="Calibri" w:cs="Calibri" w:eastAsia="Calibri" w:hAnsi="Calibri"/>
-                <w:color w:val="1E293B"/>
-                <w:sz w:val="18"/>
-                <w:szCs w:val="18"/>
-              </w:rPr>
-              <w:t xml:space="preserve">Safe-stop deceleration and maximum braking</w:t>
-            </w:r>
-          </w:p>
-        </w:tc>
-        <w:tc>
-          <w:tcPr>
-            <w:tcW w:type="dxa" w:w="1269"/>
-            <w:tcMar>
-              <w:top w:type="dxa" w:w="60"/>
-              <w:left w:type="dxa" w:w="90"/>
-              <w:bottom w:type="dxa" w:w="60"/>
-              <w:right w:type="dxa" w:w="90"/>
-            </w:tcMar>
-          </w:tcPr>
-          <w:p>
-            <w:pPr>
-              <w:spacing w:after="0" w:line="252"/>
-            </w:pPr>
-            <w:r>
-              <w:rPr>
-                <w:rFonts w:ascii="Calibri" w:cs="Calibri" w:eastAsia="Calibri" w:hAnsi="Calibri"/>
-                <w:color w:val="1E293B"/>
-                <w:sz w:val="18"/>
-                <w:szCs w:val="18"/>
-              </w:rPr>
-              <w:t xml:space="preserve">Stephen, Colin</w:t>
-            </w:r>
-          </w:p>
-        </w:tc>
-        <w:tc>
-          <w:tcPr>
-            <w:tcW w:type="dxa" w:w="1517"/>
-            <w:tcMar>
-              <w:top w:type="dxa" w:w="60"/>
-              <w:left w:type="dxa" w:w="90"/>
-              <w:bottom w:type="dxa" w:w="60"/>
-              <w:right w:type="dxa" w:w="90"/>
-            </w:tcMar>
-          </w:tcPr>
-          <w:p>
-            <w:pPr>
-              <w:spacing w:after="0" w:line="252"/>
-            </w:pPr>
-            <w:r>
-              <w:rPr>
-                <w:rFonts w:ascii="Calibri" w:cs="Calibri" w:eastAsia="Calibri" w:hAnsi="Calibri"/>
-                <w:color w:val="1E293B"/>
-                <w:sz w:val="18"/>
-                <w:szCs w:val="18"/>
-              </w:rPr>
-              <w:t xml:space="preserve">Test 3</w:t>
-            </w:r>
-          </w:p>
-        </w:tc>
-        <w:tc>
-          <w:tcPr>
-            <w:tcW w:type="dxa" w:w="2596"/>
-            <w:tcMar>
-              <w:top w:type="dxa" w:w="60"/>
-              <w:left w:type="dxa" w:w="90"/>
-              <w:bottom w:type="dxa" w:w="60"/>
-              <w:right w:type="dxa" w:w="90"/>
-            </w:tcMar>
-          </w:tcPr>
-          <w:p>
-            <w:pPr>
-              <w:spacing w:after="0" w:line="252"/>
-            </w:pPr>
-            <w:r>
-              <w:rPr>
-                <w:rFonts w:ascii="Calibri" w:cs="Calibri" w:eastAsia="Calibri" w:hAnsi="Calibri"/>
-                <w:color w:val="1E293B"/>
-                <w:sz w:val="18"/>
-                <w:szCs w:val="18"/>
-              </w:rPr>
-              <w:t xml:space="preserve">1.5 m/s² controlled; measure the maximum</w:t>
+            <w:tcW w:type="dxa" w:w="517"/>
+            <w:tcMar>
+              <w:top w:type="dxa" w:w="60"/>
+              <w:left w:type="dxa" w:w="90"/>
+              <w:bottom w:type="dxa" w:w="60"/>
+              <w:right w:type="dxa" w:w="90"/>
+            </w:tcMar>
+          </w:tcPr>
+          <w:p>
+            <w:pPr>
+              <w:spacing w:after="0" w:line="252"/>
+            </w:pPr>
+            <w:r>
+              <w:rPr>
+                <w:rFonts w:ascii="Calibri" w:cs="Calibri" w:eastAsia="Calibri" w:hAnsi="Calibri"/>
+                <w:color w:val="1E293B"/>
+                <w:sz w:val="18"/>
+                <w:szCs w:val="18"/>
+              </w:rPr>
+              <w:t xml:space="preserve">S3</w:t>
+            </w:r>
+          </w:p>
+        </w:tc>
+        <w:tc>
+          <w:tcPr>
+            <w:tcW w:type="dxa" w:w="3467"/>
+            <w:tcMar>
+              <w:top w:type="dxa" w:w="60"/>
+              <w:left w:type="dxa" w:w="90"/>
+              <w:bottom w:type="dxa" w:w="60"/>
+              <w:right w:type="dxa" w:w="90"/>
+            </w:tcMar>
+          </w:tcPr>
+          <w:p>
+            <w:pPr>
+              <w:spacing w:after="0" w:line="252"/>
+            </w:pPr>
+            <w:r>
+              <w:rPr>
+                <w:rFonts w:ascii="Calibri" w:cs="Calibri" w:eastAsia="Calibri" w:hAnsi="Calibri"/>
+                <w:color w:val="1E293B"/>
+                <w:sz w:val="18"/>
+                <w:szCs w:val="18"/>
+              </w:rPr>
+              <w:t xml:space="preserve">Steering during a stop: follow AVC, hold, or straighten?</w:t>
+            </w:r>
+          </w:p>
+        </w:tc>
+        <w:tc>
+          <w:tcPr>
+            <w:tcW w:type="dxa" w:w="1265"/>
+            <w:tcMar>
+              <w:top w:type="dxa" w:w="60"/>
+              <w:left w:type="dxa" w:w="90"/>
+              <w:bottom w:type="dxa" w:w="60"/>
+              <w:right w:type="dxa" w:w="90"/>
+            </w:tcMar>
+          </w:tcPr>
+          <w:p>
+            <w:pPr>
+              <w:spacing w:after="0" w:line="252"/>
+            </w:pPr>
+            <w:r>
+              <w:rPr>
+                <w:rFonts w:ascii="Calibri" w:cs="Calibri" w:eastAsia="Calibri" w:hAnsi="Calibri"/>
+                <w:color w:val="1E293B"/>
+                <w:sz w:val="18"/>
+                <w:szCs w:val="18"/>
+              </w:rPr>
+              <w:t xml:space="preserve">Stephen</w:t>
+            </w:r>
+          </w:p>
+        </w:tc>
+        <w:tc>
+          <w:tcPr>
+            <w:tcW w:type="dxa" w:w="1514"/>
+            <w:tcMar>
+              <w:top w:type="dxa" w:w="60"/>
+              <w:left w:type="dxa" w:w="90"/>
+              <w:bottom w:type="dxa" w:w="60"/>
+              <w:right w:type="dxa" w:w="90"/>
+            </w:tcMar>
+          </w:tcPr>
+          <w:p>
+            <w:pPr>
+              <w:spacing w:after="0" w:line="252"/>
+            </w:pPr>
+            <w:r>
+              <w:rPr>
+                <w:rFonts w:ascii="Calibri" w:cs="Calibri" w:eastAsia="Calibri" w:hAnsi="Calibri"/>
+                <w:color w:val="1E293B"/>
+                <w:sz w:val="18"/>
+                <w:szCs w:val="18"/>
+              </w:rPr>
+              <w:t xml:space="preserve">HIAS team, AVC</w:t>
+            </w:r>
+          </w:p>
+        </w:tc>
+        <w:tc>
+          <w:tcPr>
+            <w:tcW w:type="dxa" w:w="2597"/>
+            <w:tcMar>
+              <w:top w:type="dxa" w:w="60"/>
+              <w:left w:type="dxa" w:w="90"/>
+              <w:bottom w:type="dxa" w:w="60"/>
+              <w:right w:type="dxa" w:w="90"/>
+            </w:tcMar>
+          </w:tcPr>
+          <w:p>
+            <w:pPr>
+              <w:spacing w:after="0" w:line="252"/>
+            </w:pPr>
+            <w:r>
+              <w:rPr>
+                <w:rFonts w:ascii="Calibri" w:cs="Calibri" w:eastAsia="Calibri" w:hAnsi="Calibri"/>
+                <w:color w:val="1E293B"/>
+                <w:sz w:val="18"/>
+                <w:szCs w:val="18"/>
+              </w:rPr>
+              <w:t xml:space="preserve">Follow AVC if valid, else straighten</w:t>
             </w:r>
           </w:p>
         </w:tc>
@@ -21294,126 +22141,126 @@
         </w:trPr>
         <w:tc>
           <w:tcPr>
-            <w:tcW w:type="dxa" w:w="518"/>
-            <w:tcMar>
-              <w:top w:type="dxa" w:w="60"/>
-              <w:left w:type="dxa" w:w="90"/>
-              <w:bottom w:type="dxa" w:w="60"/>
-              <w:right w:type="dxa" w:w="90"/>
-            </w:tcMar>
-          </w:tcPr>
-          <w:p>
-            <w:pPr>
-              <w:spacing w:after="0" w:line="252"/>
-            </w:pPr>
-            <w:r>
-              <w:rPr>
-                <w:rFonts w:ascii="Calibri" w:cs="Calibri" w:eastAsia="Calibri" w:hAnsi="Calibri"/>
-                <w:color w:val="1E293B"/>
-                <w:sz w:val="18"/>
-                <w:szCs w:val="18"/>
-              </w:rPr>
-              <w:t xml:space="preserve">H1</w:t>
-            </w:r>
-          </w:p>
-        </w:tc>
-        <w:tc>
-          <w:tcPr>
-            <w:tcW w:type="dxa" w:w="3460"/>
-            <w:tcMar>
-              <w:top w:type="dxa" w:w="60"/>
-              <w:left w:type="dxa" w:w="90"/>
-              <w:bottom w:type="dxa" w:w="60"/>
-              <w:right w:type="dxa" w:w="90"/>
-            </w:tcMar>
-          </w:tcPr>
-          <w:p>
-            <w:pPr>
-              <w:spacing w:after="0" w:line="252"/>
-            </w:pPr>
-            <w:r>
-              <w:rPr>
-                <w:rFonts w:ascii="Calibri" w:cs="Calibri" w:eastAsia="Calibri" w:hAnsi="Calibri"/>
-                <w:color w:val="1E293B"/>
-                <w:sz w:val="18"/>
-                <w:szCs w:val="18"/>
-              </w:rPr>
-              <w:t xml:space="preserve">Vehicle: which prebuilt RC car (or kit)?</w:t>
-            </w:r>
-          </w:p>
-        </w:tc>
-        <w:tc>
-          <w:tcPr>
-            <w:tcW w:type="dxa" w:w="1269"/>
-            <w:tcMar>
-              <w:top w:type="dxa" w:w="60"/>
-              <w:left w:type="dxa" w:w="90"/>
-              <w:bottom w:type="dxa" w:w="60"/>
-              <w:right w:type="dxa" w:w="90"/>
-            </w:tcMar>
-          </w:tcPr>
-          <w:p>
-            <w:pPr>
-              <w:spacing w:after="0" w:line="252"/>
-            </w:pPr>
-            <w:r>
-              <w:rPr>
-                <w:rFonts w:ascii="Calibri" w:cs="Calibri" w:eastAsia="Calibri" w:hAnsi="Calibri"/>
-                <w:color w:val="1E293B"/>
-                <w:sz w:val="18"/>
-                <w:szCs w:val="18"/>
-              </w:rPr>
-              <w:t xml:space="preserve">Colin</w:t>
-            </w:r>
-          </w:p>
-        </w:tc>
-        <w:tc>
-          <w:tcPr>
-            <w:tcW w:type="dxa" w:w="1517"/>
-            <w:tcMar>
-              <w:top w:type="dxa" w:w="60"/>
-              <w:left w:type="dxa" w:w="90"/>
-              <w:bottom w:type="dxa" w:w="60"/>
-              <w:right w:type="dxa" w:w="90"/>
-            </w:tcMar>
-          </w:tcPr>
-          <w:p>
-            <w:pPr>
-              <w:spacing w:after="0" w:line="252"/>
-            </w:pPr>
-            <w:r>
-              <w:rPr>
-                <w:rFonts w:ascii="Calibri" w:cs="Calibri" w:eastAsia="Calibri" w:hAnsi="Calibri"/>
-                <w:color w:val="1E293B"/>
-                <w:sz w:val="18"/>
-                <w:szCs w:val="18"/>
-              </w:rPr>
-              <w:t xml:space="preserve">Class / instructor</w:t>
-            </w:r>
-          </w:p>
-        </w:tc>
-        <w:tc>
-          <w:tcPr>
-            <w:tcW w:type="dxa" w:w="2596"/>
-            <w:tcMar>
-              <w:top w:type="dxa" w:w="60"/>
-              <w:left w:type="dxa" w:w="90"/>
-              <w:bottom w:type="dxa" w:w="60"/>
-              <w:right w:type="dxa" w:w="90"/>
-            </w:tcMar>
-          </w:tcPr>
-          <w:p>
-            <w:pPr>
-              <w:spacing w:after="0" w:line="252"/>
-            </w:pPr>
-            <w:r>
-              <w:rPr>
-                <w:rFonts w:ascii="Calibri" w:cs="Calibri" w:eastAsia="Calibri" w:hAnsi="Calibri"/>
-                <w:color w:val="1E293B"/>
-                <w:sz w:val="18"/>
-                <w:szCs w:val="18"/>
-              </w:rPr>
-              <w:t xml:space="preserve">Prebuilt RC car with ESC + servo</w:t>
+            <w:tcW w:type="dxa" w:w="517"/>
+            <w:tcMar>
+              <w:top w:type="dxa" w:w="60"/>
+              <w:left w:type="dxa" w:w="90"/>
+              <w:bottom w:type="dxa" w:w="60"/>
+              <w:right w:type="dxa" w:w="90"/>
+            </w:tcMar>
+          </w:tcPr>
+          <w:p>
+            <w:pPr>
+              <w:spacing w:after="0" w:line="252"/>
+            </w:pPr>
+            <w:r>
+              <w:rPr>
+                <w:rFonts w:ascii="Calibri" w:cs="Calibri" w:eastAsia="Calibri" w:hAnsi="Calibri"/>
+                <w:color w:val="1E293B"/>
+                <w:sz w:val="18"/>
+                <w:szCs w:val="18"/>
+              </w:rPr>
+              <w:t xml:space="preserve">S4</w:t>
+            </w:r>
+          </w:p>
+        </w:tc>
+        <w:tc>
+          <w:tcPr>
+            <w:tcW w:type="dxa" w:w="3467"/>
+            <w:tcMar>
+              <w:top w:type="dxa" w:w="60"/>
+              <w:left w:type="dxa" w:w="90"/>
+              <w:bottom w:type="dxa" w:w="60"/>
+              <w:right w:type="dxa" w:w="90"/>
+            </w:tcMar>
+          </w:tcPr>
+          <w:p>
+            <w:pPr>
+              <w:spacing w:after="0" w:line="252"/>
+            </w:pPr>
+            <w:r>
+              <w:rPr>
+                <w:rFonts w:ascii="Calibri" w:cs="Calibri" w:eastAsia="Calibri" w:hAnsi="Calibri"/>
+                <w:color w:val="1E293B"/>
+                <w:sz w:val="18"/>
+                <w:szCs w:val="18"/>
+              </w:rPr>
+              <w:t xml:space="preserve">Safe-stop deceleration and maximum braking</w:t>
+            </w:r>
+          </w:p>
+        </w:tc>
+        <w:tc>
+          <w:tcPr>
+            <w:tcW w:type="dxa" w:w="1265"/>
+            <w:tcMar>
+              <w:top w:type="dxa" w:w="60"/>
+              <w:left w:type="dxa" w:w="90"/>
+              <w:bottom w:type="dxa" w:w="60"/>
+              <w:right w:type="dxa" w:w="90"/>
+            </w:tcMar>
+          </w:tcPr>
+          <w:p>
+            <w:pPr>
+              <w:spacing w:after="0" w:line="252"/>
+            </w:pPr>
+            <w:r>
+              <w:rPr>
+                <w:rFonts w:ascii="Calibri" w:cs="Calibri" w:eastAsia="Calibri" w:hAnsi="Calibri"/>
+                <w:color w:val="1E293B"/>
+                <w:sz w:val="18"/>
+                <w:szCs w:val="18"/>
+              </w:rPr>
+              <w:t xml:space="preserve">Stephen, Colin</w:t>
+            </w:r>
+          </w:p>
+        </w:tc>
+        <w:tc>
+          <w:tcPr>
+            <w:tcW w:type="dxa" w:w="1514"/>
+            <w:tcMar>
+              <w:top w:type="dxa" w:w="60"/>
+              <w:left w:type="dxa" w:w="90"/>
+              <w:bottom w:type="dxa" w:w="60"/>
+              <w:right w:type="dxa" w:w="90"/>
+            </w:tcMar>
+          </w:tcPr>
+          <w:p>
+            <w:pPr>
+              <w:spacing w:after="0" w:line="252"/>
+            </w:pPr>
+            <w:r>
+              <w:rPr>
+                <w:rFonts w:ascii="Calibri" w:cs="Calibri" w:eastAsia="Calibri" w:hAnsi="Calibri"/>
+                <w:color w:val="1E293B"/>
+                <w:sz w:val="18"/>
+                <w:szCs w:val="18"/>
+              </w:rPr>
+              <w:t xml:space="preserve">Test 3</w:t>
+            </w:r>
+          </w:p>
+        </w:tc>
+        <w:tc>
+          <w:tcPr>
+            <w:tcW w:type="dxa" w:w="2597"/>
+            <w:tcMar>
+              <w:top w:type="dxa" w:w="60"/>
+              <w:left w:type="dxa" w:w="90"/>
+              <w:bottom w:type="dxa" w:w="60"/>
+              <w:right w:type="dxa" w:w="90"/>
+            </w:tcMar>
+          </w:tcPr>
+          <w:p>
+            <w:pPr>
+              <w:spacing w:after="0" w:line="252"/>
+            </w:pPr>
+            <w:r>
+              <w:rPr>
+                <w:rFonts w:ascii="Calibri" w:cs="Calibri" w:eastAsia="Calibri" w:hAnsi="Calibri"/>
+                <w:color w:val="1E293B"/>
+                <w:sz w:val="18"/>
+                <w:szCs w:val="18"/>
+              </w:rPr>
+              <w:t xml:space="preserve">1.5 m/s² controlled; measure the maximum</w:t>
             </w:r>
           </w:p>
         </w:tc>
@@ -21424,57 +22271,57 @@
         </w:trPr>
         <w:tc>
           <w:tcPr>
-            <w:tcW w:type="dxa" w:w="518"/>
-            <w:tcMar>
-              <w:top w:type="dxa" w:w="60"/>
-              <w:left w:type="dxa" w:w="90"/>
-              <w:bottom w:type="dxa" w:w="60"/>
-              <w:right w:type="dxa" w:w="90"/>
-            </w:tcMar>
-          </w:tcPr>
-          <w:p>
-            <w:pPr>
-              <w:spacing w:after="0" w:line="252"/>
-            </w:pPr>
-            <w:r>
-              <w:rPr>
-                <w:rFonts w:ascii="Calibri" w:cs="Calibri" w:eastAsia="Calibri" w:hAnsi="Calibri"/>
-                <w:color w:val="1E293B"/>
-                <w:sz w:val="18"/>
-                <w:szCs w:val="18"/>
-              </w:rPr>
-              <w:t xml:space="preserve">H2</w:t>
-            </w:r>
-          </w:p>
-        </w:tc>
-        <w:tc>
-          <w:tcPr>
-            <w:tcW w:type="dxa" w:w="3460"/>
-            <w:tcMar>
-              <w:top w:type="dxa" w:w="60"/>
-              <w:left w:type="dxa" w:w="90"/>
-              <w:bottom w:type="dxa" w:w="60"/>
-              <w:right w:type="dxa" w:w="90"/>
-            </w:tcMar>
-          </w:tcPr>
-          <w:p>
-            <w:pPr>
-              <w:spacing w:after="0" w:line="252"/>
-            </w:pPr>
-            <w:r>
-              <w:rPr>
-                <w:rFonts w:ascii="Calibri" w:cs="Calibri" w:eastAsia="Calibri" w:hAnsi="Calibri"/>
-                <w:color w:val="1E293B"/>
-                <w:sz w:val="18"/>
-                <w:szCs w:val="18"/>
-              </w:rPr>
-              <w:t xml:space="preserve">Microcontroller</w:t>
-            </w:r>
-          </w:p>
-        </w:tc>
-        <w:tc>
-          <w:tcPr>
-            <w:tcW w:type="dxa" w:w="1269"/>
+            <w:tcW w:type="dxa" w:w="517"/>
+            <w:tcMar>
+              <w:top w:type="dxa" w:w="60"/>
+              <w:left w:type="dxa" w:w="90"/>
+              <w:bottom w:type="dxa" w:w="60"/>
+              <w:right w:type="dxa" w:w="90"/>
+            </w:tcMar>
+          </w:tcPr>
+          <w:p>
+            <w:pPr>
+              <w:spacing w:after="0" w:line="252"/>
+            </w:pPr>
+            <w:r>
+              <w:rPr>
+                <w:rFonts w:ascii="Calibri" w:cs="Calibri" w:eastAsia="Calibri" w:hAnsi="Calibri"/>
+                <w:color w:val="1E293B"/>
+                <w:sz w:val="18"/>
+                <w:szCs w:val="18"/>
+              </w:rPr>
+              <w:t xml:space="preserve">H1</w:t>
+            </w:r>
+          </w:p>
+        </w:tc>
+        <w:tc>
+          <w:tcPr>
+            <w:tcW w:type="dxa" w:w="3467"/>
+            <w:tcMar>
+              <w:top w:type="dxa" w:w="60"/>
+              <w:left w:type="dxa" w:w="90"/>
+              <w:bottom w:type="dxa" w:w="60"/>
+              <w:right w:type="dxa" w:w="90"/>
+            </w:tcMar>
+          </w:tcPr>
+          <w:p>
+            <w:pPr>
+              <w:spacing w:after="0" w:line="252"/>
+            </w:pPr>
+            <w:r>
+              <w:rPr>
+                <w:rFonts w:ascii="Calibri" w:cs="Calibri" w:eastAsia="Calibri" w:hAnsi="Calibri"/>
+                <w:color w:val="1E293B"/>
+                <w:sz w:val="18"/>
+                <w:szCs w:val="18"/>
+              </w:rPr>
+              <w:t xml:space="preserve">Vehicle: which prebuilt RC car (or kit)?</w:t>
+            </w:r>
+          </w:p>
+        </w:tc>
+        <w:tc>
+          <w:tcPr>
+            <w:tcW w:type="dxa" w:w="1265"/>
             <w:tcMar>
               <w:top w:type="dxa" w:w="60"/>
               <w:left w:type="dxa" w:w="90"/>
@@ -21499,51 +22346,51 @@
         </w:tc>
         <w:tc>
           <w:tcPr>
-            <w:tcW w:type="dxa" w:w="1517"/>
-            <w:tcMar>
-              <w:top w:type="dxa" w:w="60"/>
-              <w:left w:type="dxa" w:w="90"/>
-              <w:bottom w:type="dxa" w:w="60"/>
-              <w:right w:type="dxa" w:w="90"/>
-            </w:tcMar>
-          </w:tcPr>
-          <w:p>
-            <w:pPr>
-              <w:spacing w:after="0" w:line="252"/>
-            </w:pPr>
-            <w:r>
-              <w:rPr>
-                <w:rFonts w:ascii="Calibri" w:cs="Calibri" w:eastAsia="Calibri" w:hAnsi="Calibri"/>
-                <w:color w:val="1E293B"/>
-                <w:sz w:val="18"/>
-                <w:szCs w:val="18"/>
-              </w:rPr>
-              <w:t xml:space="preserve">HIAS team</w:t>
-            </w:r>
-          </w:p>
-        </w:tc>
-        <w:tc>
-          <w:tcPr>
-            <w:tcW w:type="dxa" w:w="2596"/>
-            <w:tcMar>
-              <w:top w:type="dxa" w:w="60"/>
-              <w:left w:type="dxa" w:w="90"/>
-              <w:bottom w:type="dxa" w:w="60"/>
-              <w:right w:type="dxa" w:w="90"/>
-            </w:tcMar>
-          </w:tcPr>
-          <w:p>
-            <w:pPr>
-              <w:spacing w:after="0" w:line="252"/>
-            </w:pPr>
-            <w:r>
-              <w:rPr>
-                <w:rFonts w:ascii="Calibri" w:cs="Calibri" w:eastAsia="Calibri" w:hAnsi="Calibri"/>
-                <w:color w:val="1E293B"/>
-                <w:sz w:val="18"/>
-                <w:szCs w:val="18"/>
-              </w:rPr>
-              <w:t xml:space="preserve">ESP32</w:t>
+            <w:tcW w:type="dxa" w:w="1514"/>
+            <w:tcMar>
+              <w:top w:type="dxa" w:w="60"/>
+              <w:left w:type="dxa" w:w="90"/>
+              <w:bottom w:type="dxa" w:w="60"/>
+              <w:right w:type="dxa" w:w="90"/>
+            </w:tcMar>
+          </w:tcPr>
+          <w:p>
+            <w:pPr>
+              <w:spacing w:after="0" w:line="252"/>
+            </w:pPr>
+            <w:r>
+              <w:rPr>
+                <w:rFonts w:ascii="Calibri" w:cs="Calibri" w:eastAsia="Calibri" w:hAnsi="Calibri"/>
+                <w:color w:val="1E293B"/>
+                <w:sz w:val="18"/>
+                <w:szCs w:val="18"/>
+              </w:rPr>
+              <w:t xml:space="preserve">Class / instructor</w:t>
+            </w:r>
+          </w:p>
+        </w:tc>
+        <w:tc>
+          <w:tcPr>
+            <w:tcW w:type="dxa" w:w="2597"/>
+            <w:tcMar>
+              <w:top w:type="dxa" w:w="60"/>
+              <w:left w:type="dxa" w:w="90"/>
+              <w:bottom w:type="dxa" w:w="60"/>
+              <w:right w:type="dxa" w:w="90"/>
+            </w:tcMar>
+          </w:tcPr>
+          <w:p>
+            <w:pPr>
+              <w:spacing w:after="0" w:line="252"/>
+            </w:pPr>
+            <w:r>
+              <w:rPr>
+                <w:rFonts w:ascii="Calibri" w:cs="Calibri" w:eastAsia="Calibri" w:hAnsi="Calibri"/>
+                <w:color w:val="1E293B"/>
+                <w:sz w:val="18"/>
+                <w:szCs w:val="18"/>
+              </w:rPr>
+              <w:t xml:space="preserve">Prebuilt RC car with ESC + servo</w:t>
             </w:r>
           </w:p>
         </w:tc>
@@ -21554,57 +22401,57 @@
         </w:trPr>
         <w:tc>
           <w:tcPr>
-            <w:tcW w:type="dxa" w:w="518"/>
-            <w:tcMar>
-              <w:top w:type="dxa" w:w="60"/>
-              <w:left w:type="dxa" w:w="90"/>
-              <w:bottom w:type="dxa" w:w="60"/>
-              <w:right w:type="dxa" w:w="90"/>
-            </w:tcMar>
-          </w:tcPr>
-          <w:p>
-            <w:pPr>
-              <w:spacing w:after="0" w:line="252"/>
-            </w:pPr>
-            <w:r>
-              <w:rPr>
-                <w:rFonts w:ascii="Calibri" w:cs="Calibri" w:eastAsia="Calibri" w:hAnsi="Calibri"/>
-                <w:color w:val="1E293B"/>
-                <w:sz w:val="18"/>
-                <w:szCs w:val="18"/>
-              </w:rPr>
-              <w:t xml:space="preserve">H3</w:t>
-            </w:r>
-          </w:p>
-        </w:tc>
-        <w:tc>
-          <w:tcPr>
-            <w:tcW w:type="dxa" w:w="3460"/>
-            <w:tcMar>
-              <w:top w:type="dxa" w:w="60"/>
-              <w:left w:type="dxa" w:w="90"/>
-              <w:bottom w:type="dxa" w:w="60"/>
-              <w:right w:type="dxa" w:w="90"/>
-            </w:tcMar>
-          </w:tcPr>
-          <w:p>
-            <w:pPr>
-              <w:spacing w:after="0" w:line="252"/>
-            </w:pPr>
-            <w:r>
-              <w:rPr>
-                <w:rFonts w:ascii="Calibri" w:cs="Calibri" w:eastAsia="Calibri" w:hAnsi="Calibri"/>
-                <w:color w:val="1E293B"/>
-                <w:sz w:val="18"/>
-                <w:szCs w:val="18"/>
-              </w:rPr>
-              <w:t xml:space="preserve">Wheel-speed sensor type and pulses per revolution</w:t>
-            </w:r>
-          </w:p>
-        </w:tc>
-        <w:tc>
-          <w:tcPr>
-            <w:tcW w:type="dxa" w:w="1269"/>
+            <w:tcW w:type="dxa" w:w="517"/>
+            <w:tcMar>
+              <w:top w:type="dxa" w:w="60"/>
+              <w:left w:type="dxa" w:w="90"/>
+              <w:bottom w:type="dxa" w:w="60"/>
+              <w:right w:type="dxa" w:w="90"/>
+            </w:tcMar>
+          </w:tcPr>
+          <w:p>
+            <w:pPr>
+              <w:spacing w:after="0" w:line="252"/>
+            </w:pPr>
+            <w:r>
+              <w:rPr>
+                <w:rFonts w:ascii="Calibri" w:cs="Calibri" w:eastAsia="Calibri" w:hAnsi="Calibri"/>
+                <w:color w:val="1E293B"/>
+                <w:sz w:val="18"/>
+                <w:szCs w:val="18"/>
+              </w:rPr>
+              <w:t xml:space="preserve">H2</w:t>
+            </w:r>
+          </w:p>
+        </w:tc>
+        <w:tc>
+          <w:tcPr>
+            <w:tcW w:type="dxa" w:w="3467"/>
+            <w:tcMar>
+              <w:top w:type="dxa" w:w="60"/>
+              <w:left w:type="dxa" w:w="90"/>
+              <w:bottom w:type="dxa" w:w="60"/>
+              <w:right w:type="dxa" w:w="90"/>
+            </w:tcMar>
+          </w:tcPr>
+          <w:p>
+            <w:pPr>
+              <w:spacing w:after="0" w:line="252"/>
+            </w:pPr>
+            <w:r>
+              <w:rPr>
+                <w:rFonts w:ascii="Calibri" w:cs="Calibri" w:eastAsia="Calibri" w:hAnsi="Calibri"/>
+                <w:color w:val="1E293B"/>
+                <w:sz w:val="18"/>
+                <w:szCs w:val="18"/>
+              </w:rPr>
+              <w:t xml:space="preserve">Microcontroller</w:t>
+            </w:r>
+          </w:p>
+        </w:tc>
+        <w:tc>
+          <w:tcPr>
+            <w:tcW w:type="dxa" w:w="1265"/>
             <w:tcMar>
               <w:top w:type="dxa" w:w="60"/>
               <w:left w:type="dxa" w:w="90"/>
@@ -21629,51 +22476,51 @@
         </w:tc>
         <w:tc>
           <w:tcPr>
-            <w:tcW w:type="dxa" w:w="1517"/>
-            <w:tcMar>
-              <w:top w:type="dxa" w:w="60"/>
-              <w:left w:type="dxa" w:w="90"/>
-              <w:bottom w:type="dxa" w:w="60"/>
-              <w:right w:type="dxa" w:w="90"/>
-            </w:tcMar>
-          </w:tcPr>
-          <w:p>
-            <w:pPr>
-              <w:spacing w:after="0" w:line="252"/>
-            </w:pPr>
-            <w:r>
-              <w:rPr>
-                <w:rFonts w:ascii="Calibri" w:cs="Calibri" w:eastAsia="Calibri" w:hAnsi="Calibri"/>
-                <w:color w:val="1E293B"/>
-                <w:sz w:val="18"/>
-                <w:szCs w:val="18"/>
-              </w:rPr>
-              <w:t xml:space="preserve">—</w:t>
-            </w:r>
-          </w:p>
-        </w:tc>
-        <w:tc>
-          <w:tcPr>
-            <w:tcW w:type="dxa" w:w="2596"/>
-            <w:tcMar>
-              <w:top w:type="dxa" w:w="60"/>
-              <w:left w:type="dxa" w:w="90"/>
-              <w:bottom w:type="dxa" w:w="60"/>
-              <w:right w:type="dxa" w:w="90"/>
-            </w:tcMar>
-          </w:tcPr>
-          <w:p>
-            <w:pPr>
-              <w:spacing w:after="0" w:line="252"/>
-            </w:pPr>
-            <w:r>
-              <w:rPr>
-                <w:rFonts w:ascii="Calibri" w:cs="Calibri" w:eastAsia="Calibri" w:hAnsi="Calibri"/>
-                <w:color w:val="1E293B"/>
-                <w:sz w:val="18"/>
-                <w:szCs w:val="18"/>
-              </w:rPr>
-              <w:t xml:space="preserve">Hall sensor on the drive shaft</w:t>
+            <w:tcW w:type="dxa" w:w="1514"/>
+            <w:tcMar>
+              <w:top w:type="dxa" w:w="60"/>
+              <w:left w:type="dxa" w:w="90"/>
+              <w:bottom w:type="dxa" w:w="60"/>
+              <w:right w:type="dxa" w:w="90"/>
+            </w:tcMar>
+          </w:tcPr>
+          <w:p>
+            <w:pPr>
+              <w:spacing w:after="0" w:line="252"/>
+            </w:pPr>
+            <w:r>
+              <w:rPr>
+                <w:rFonts w:ascii="Calibri" w:cs="Calibri" w:eastAsia="Calibri" w:hAnsi="Calibri"/>
+                <w:color w:val="1E293B"/>
+                <w:sz w:val="18"/>
+                <w:szCs w:val="18"/>
+              </w:rPr>
+              <w:t xml:space="preserve">HIAS team</w:t>
+            </w:r>
+          </w:p>
+        </w:tc>
+        <w:tc>
+          <w:tcPr>
+            <w:tcW w:type="dxa" w:w="2597"/>
+            <w:tcMar>
+              <w:top w:type="dxa" w:w="60"/>
+              <w:left w:type="dxa" w:w="90"/>
+              <w:bottom w:type="dxa" w:w="60"/>
+              <w:right w:type="dxa" w:w="90"/>
+            </w:tcMar>
+          </w:tcPr>
+          <w:p>
+            <w:pPr>
+              <w:spacing w:after="0" w:line="252"/>
+            </w:pPr>
+            <w:r>
+              <w:rPr>
+                <w:rFonts w:ascii="Calibri" w:cs="Calibri" w:eastAsia="Calibri" w:hAnsi="Calibri"/>
+                <w:color w:val="1E293B"/>
+                <w:sz w:val="18"/>
+                <w:szCs w:val="18"/>
+              </w:rPr>
+              <w:t xml:space="preserve">ESP32</w:t>
             </w:r>
           </w:p>
         </w:tc>
@@ -21684,57 +22531,57 @@
         </w:trPr>
         <w:tc>
           <w:tcPr>
-            <w:tcW w:type="dxa" w:w="518"/>
-            <w:tcMar>
-              <w:top w:type="dxa" w:w="60"/>
-              <w:left w:type="dxa" w:w="90"/>
-              <w:bottom w:type="dxa" w:w="60"/>
-              <w:right w:type="dxa" w:w="90"/>
-            </w:tcMar>
-          </w:tcPr>
-          <w:p>
-            <w:pPr>
-              <w:spacing w:after="0" w:line="252"/>
-            </w:pPr>
-            <w:r>
-              <w:rPr>
-                <w:rFonts w:ascii="Calibri" w:cs="Calibri" w:eastAsia="Calibri" w:hAnsi="Calibri"/>
-                <w:color w:val="1E293B"/>
-                <w:sz w:val="18"/>
-                <w:szCs w:val="18"/>
-              </w:rPr>
-              <w:t xml:space="preserve">H4</w:t>
-            </w:r>
-          </w:p>
-        </w:tc>
-        <w:tc>
-          <w:tcPr>
-            <w:tcW w:type="dxa" w:w="3460"/>
-            <w:tcMar>
-              <w:top w:type="dxa" w:w="60"/>
-              <w:left w:type="dxa" w:w="90"/>
-              <w:bottom w:type="dxa" w:w="60"/>
-              <w:right w:type="dxa" w:w="90"/>
-            </w:tcMar>
-          </w:tcPr>
-          <w:p>
-            <w:pPr>
-              <w:spacing w:after="0" w:line="252"/>
-            </w:pPr>
-            <w:r>
-              <w:rPr>
-                <w:rFonts w:ascii="Calibri" w:cs="Calibri" w:eastAsia="Calibri" w:hAnsi="Calibri"/>
-                <w:color w:val="1E293B"/>
-                <w:sz w:val="18"/>
-                <w:szCs w:val="18"/>
-              </w:rPr>
-              <w:t xml:space="preserve">Battery type, and whether the microcontroller runs from the same battery</w:t>
-            </w:r>
-          </w:p>
-        </w:tc>
-        <w:tc>
-          <w:tcPr>
-            <w:tcW w:type="dxa" w:w="1269"/>
+            <w:tcW w:type="dxa" w:w="517"/>
+            <w:tcMar>
+              <w:top w:type="dxa" w:w="60"/>
+              <w:left w:type="dxa" w:w="90"/>
+              <w:bottom w:type="dxa" w:w="60"/>
+              <w:right w:type="dxa" w:w="90"/>
+            </w:tcMar>
+          </w:tcPr>
+          <w:p>
+            <w:pPr>
+              <w:spacing w:after="0" w:line="252"/>
+            </w:pPr>
+            <w:r>
+              <w:rPr>
+                <w:rFonts w:ascii="Calibri" w:cs="Calibri" w:eastAsia="Calibri" w:hAnsi="Calibri"/>
+                <w:color w:val="1E293B"/>
+                <w:sz w:val="18"/>
+                <w:szCs w:val="18"/>
+              </w:rPr>
+              <w:t xml:space="preserve">H3</w:t>
+            </w:r>
+          </w:p>
+        </w:tc>
+        <w:tc>
+          <w:tcPr>
+            <w:tcW w:type="dxa" w:w="3467"/>
+            <w:tcMar>
+              <w:top w:type="dxa" w:w="60"/>
+              <w:left w:type="dxa" w:w="90"/>
+              <w:bottom w:type="dxa" w:w="60"/>
+              <w:right w:type="dxa" w:w="90"/>
+            </w:tcMar>
+          </w:tcPr>
+          <w:p>
+            <w:pPr>
+              <w:spacing w:after="0" w:line="252"/>
+            </w:pPr>
+            <w:r>
+              <w:rPr>
+                <w:rFonts w:ascii="Calibri" w:cs="Calibri" w:eastAsia="Calibri" w:hAnsi="Calibri"/>
+                <w:color w:val="1E293B"/>
+                <w:sz w:val="18"/>
+                <w:szCs w:val="18"/>
+              </w:rPr>
+              <w:t xml:space="preserve">Wheel-speed sensor type and pulses per revolution</w:t>
+            </w:r>
+          </w:p>
+        </w:tc>
+        <w:tc>
+          <w:tcPr>
+            <w:tcW w:type="dxa" w:w="1265"/>
             <w:tcMar>
               <w:top w:type="dxa" w:w="60"/>
               <w:left w:type="dxa" w:w="90"/>
@@ -21759,7 +22606,7 @@
         </w:tc>
         <w:tc>
           <w:tcPr>
-            <w:tcW w:type="dxa" w:w="1517"/>
+            <w:tcW w:type="dxa" w:w="1514"/>
             <w:tcMar>
               <w:top w:type="dxa" w:w="60"/>
               <w:left w:type="dxa" w:w="90"/>
@@ -21784,26 +22631,26 @@
         </w:tc>
         <w:tc>
           <w:tcPr>
-            <w:tcW w:type="dxa" w:w="2596"/>
-            <w:tcMar>
-              <w:top w:type="dxa" w:w="60"/>
-              <w:left w:type="dxa" w:w="90"/>
-              <w:bottom w:type="dxa" w:w="60"/>
-              <w:right w:type="dxa" w:w="90"/>
-            </w:tcMar>
-          </w:tcPr>
-          <w:p>
-            <w:pPr>
-              <w:spacing w:after="0" w:line="252"/>
-            </w:pPr>
-            <w:r>
-              <w:rPr>
-                <w:rFonts w:ascii="Calibri" w:cs="Calibri" w:eastAsia="Calibri" w:hAnsi="Calibri"/>
-                <w:color w:val="1E293B"/>
-                <w:sz w:val="18"/>
-                <w:szCs w:val="18"/>
-              </w:rPr>
-              <w:t xml:space="preserve">2S LiPo; microcontroller on its own regulator</w:t>
+            <w:tcW w:type="dxa" w:w="2597"/>
+            <w:tcMar>
+              <w:top w:type="dxa" w:w="60"/>
+              <w:left w:type="dxa" w:w="90"/>
+              <w:bottom w:type="dxa" w:w="60"/>
+              <w:right w:type="dxa" w:w="90"/>
+            </w:tcMar>
+          </w:tcPr>
+          <w:p>
+            <w:pPr>
+              <w:spacing w:after="0" w:line="252"/>
+            </w:pPr>
+            <w:r>
+              <w:rPr>
+                <w:rFonts w:ascii="Calibri" w:cs="Calibri" w:eastAsia="Calibri" w:hAnsi="Calibri"/>
+                <w:color w:val="1E293B"/>
+                <w:sz w:val="18"/>
+                <w:szCs w:val="18"/>
+              </w:rPr>
+              <w:t xml:space="preserve">Hall sensor on the drive shaft</w:t>
             </w:r>
           </w:p>
         </w:tc>
@@ -21814,57 +22661,57 @@
         </w:trPr>
         <w:tc>
           <w:tcPr>
-            <w:tcW w:type="dxa" w:w="518"/>
-            <w:tcMar>
-              <w:top w:type="dxa" w:w="60"/>
-              <w:left w:type="dxa" w:w="90"/>
-              <w:bottom w:type="dxa" w:w="60"/>
-              <w:right w:type="dxa" w:w="90"/>
-            </w:tcMar>
-          </w:tcPr>
-          <w:p>
-            <w:pPr>
-              <w:spacing w:after="0" w:line="252"/>
-            </w:pPr>
-            <w:r>
-              <w:rPr>
-                <w:rFonts w:ascii="Calibri" w:cs="Calibri" w:eastAsia="Calibri" w:hAnsi="Calibri"/>
-                <w:color w:val="1E293B"/>
-                <w:sz w:val="18"/>
-                <w:szCs w:val="18"/>
-              </w:rPr>
-              <w:t xml:space="preserve">H5</w:t>
-            </w:r>
-          </w:p>
-        </w:tc>
-        <w:tc>
-          <w:tcPr>
-            <w:tcW w:type="dxa" w:w="3460"/>
-            <w:tcMar>
-              <w:top w:type="dxa" w:w="60"/>
-              <w:left w:type="dxa" w:w="90"/>
-              <w:bottom w:type="dxa" w:w="60"/>
-              <w:right w:type="dxa" w:w="90"/>
-            </w:tcMar>
-          </w:tcPr>
-          <w:p>
-            <w:pPr>
-              <w:spacing w:after="0" w:line="252"/>
-            </w:pPr>
-            <w:r>
-              <w:rPr>
-                <w:rFonts w:ascii="Calibri" w:cs="Calibri" w:eastAsia="Calibri" w:hAnsi="Calibri"/>
-                <w:color w:val="1E293B"/>
-                <w:sz w:val="18"/>
-                <w:szCs w:val="18"/>
-              </w:rPr>
-              <w:t xml:space="preserve">Real top speed and steering limit of the chosen car</w:t>
-            </w:r>
-          </w:p>
-        </w:tc>
-        <w:tc>
-          <w:tcPr>
-            <w:tcW w:type="dxa" w:w="1269"/>
+            <w:tcW w:type="dxa" w:w="517"/>
+            <w:tcMar>
+              <w:top w:type="dxa" w:w="60"/>
+              <w:left w:type="dxa" w:w="90"/>
+              <w:bottom w:type="dxa" w:w="60"/>
+              <w:right w:type="dxa" w:w="90"/>
+            </w:tcMar>
+          </w:tcPr>
+          <w:p>
+            <w:pPr>
+              <w:spacing w:after="0" w:line="252"/>
+            </w:pPr>
+            <w:r>
+              <w:rPr>
+                <w:rFonts w:ascii="Calibri" w:cs="Calibri" w:eastAsia="Calibri" w:hAnsi="Calibri"/>
+                <w:color w:val="1E293B"/>
+                <w:sz w:val="18"/>
+                <w:szCs w:val="18"/>
+              </w:rPr>
+              <w:t xml:space="preserve">H4</w:t>
+            </w:r>
+          </w:p>
+        </w:tc>
+        <w:tc>
+          <w:tcPr>
+            <w:tcW w:type="dxa" w:w="3467"/>
+            <w:tcMar>
+              <w:top w:type="dxa" w:w="60"/>
+              <w:left w:type="dxa" w:w="90"/>
+              <w:bottom w:type="dxa" w:w="60"/>
+              <w:right w:type="dxa" w:w="90"/>
+            </w:tcMar>
+          </w:tcPr>
+          <w:p>
+            <w:pPr>
+              <w:spacing w:after="0" w:line="252"/>
+            </w:pPr>
+            <w:r>
+              <w:rPr>
+                <w:rFonts w:ascii="Calibri" w:cs="Calibri" w:eastAsia="Calibri" w:hAnsi="Calibri"/>
+                <w:color w:val="1E293B"/>
+                <w:sz w:val="18"/>
+                <w:szCs w:val="18"/>
+              </w:rPr>
+              <w:t xml:space="preserve">Battery type, and whether the microcontroller runs from the same battery</w:t>
+            </w:r>
+          </w:p>
+        </w:tc>
+        <w:tc>
+          <w:tcPr>
+            <w:tcW w:type="dxa" w:w="1265"/>
             <w:tcMar>
               <w:top w:type="dxa" w:w="60"/>
               <w:left w:type="dxa" w:w="90"/>
@@ -21889,51 +22736,51 @@
         </w:tc>
         <w:tc>
           <w:tcPr>
-            <w:tcW w:type="dxa" w:w="1517"/>
-            <w:tcMar>
-              <w:top w:type="dxa" w:w="60"/>
-              <w:left w:type="dxa" w:w="90"/>
-              <w:bottom w:type="dxa" w:w="60"/>
-              <w:right w:type="dxa" w:w="90"/>
-            </w:tcMar>
-          </w:tcPr>
-          <w:p>
-            <w:pPr>
-              <w:spacing w:after="0" w:line="252"/>
-            </w:pPr>
-            <w:r>
-              <w:rPr>
-                <w:rFonts w:ascii="Calibri" w:cs="Calibri" w:eastAsia="Calibri" w:hAnsi="Calibri"/>
-                <w:color w:val="1E293B"/>
-                <w:sz w:val="18"/>
-                <w:szCs w:val="18"/>
-              </w:rPr>
-              <w:t xml:space="preserve">AVC</w:t>
-            </w:r>
-          </w:p>
-        </w:tc>
-        <w:tc>
-          <w:tcPr>
-            <w:tcW w:type="dxa" w:w="2596"/>
-            <w:tcMar>
-              <w:top w:type="dxa" w:w="60"/>
-              <w:left w:type="dxa" w:w="90"/>
-              <w:bottom w:type="dxa" w:w="60"/>
-              <w:right w:type="dxa" w:w="90"/>
-            </w:tcMar>
-          </w:tcPr>
-          <w:p>
-            <w:pPr>
-              <w:spacing w:after="0" w:line="252"/>
-            </w:pPr>
-            <w:r>
-              <w:rPr>
-                <w:rFonts w:ascii="Calibri" w:cs="Calibri" w:eastAsia="Calibri" w:hAnsi="Calibri"/>
-                <w:color w:val="1E293B"/>
-                <w:sz w:val="18"/>
-                <w:szCs w:val="18"/>
-              </w:rPr>
-              <w:t xml:space="preserve">3.5 m/s, ±25° (and a 1.0 m/s cap for early tests)</w:t>
+            <w:tcW w:type="dxa" w:w="1514"/>
+            <w:tcMar>
+              <w:top w:type="dxa" w:w="60"/>
+              <w:left w:type="dxa" w:w="90"/>
+              <w:bottom w:type="dxa" w:w="60"/>
+              <w:right w:type="dxa" w:w="90"/>
+            </w:tcMar>
+          </w:tcPr>
+          <w:p>
+            <w:pPr>
+              <w:spacing w:after="0" w:line="252"/>
+            </w:pPr>
+            <w:r>
+              <w:rPr>
+                <w:rFonts w:ascii="Calibri" w:cs="Calibri" w:eastAsia="Calibri" w:hAnsi="Calibri"/>
+                <w:color w:val="1E293B"/>
+                <w:sz w:val="18"/>
+                <w:szCs w:val="18"/>
+              </w:rPr>
+              <w:t xml:space="preserve">—</w:t>
+            </w:r>
+          </w:p>
+        </w:tc>
+        <w:tc>
+          <w:tcPr>
+            <w:tcW w:type="dxa" w:w="2597"/>
+            <w:tcMar>
+              <w:top w:type="dxa" w:w="60"/>
+              <w:left w:type="dxa" w:w="90"/>
+              <w:bottom w:type="dxa" w:w="60"/>
+              <w:right w:type="dxa" w:w="90"/>
+            </w:tcMar>
+          </w:tcPr>
+          <w:p>
+            <w:pPr>
+              <w:spacing w:after="0" w:line="252"/>
+            </w:pPr>
+            <w:r>
+              <w:rPr>
+                <w:rFonts w:ascii="Calibri" w:cs="Calibri" w:eastAsia="Calibri" w:hAnsi="Calibri"/>
+                <w:color w:val="1E293B"/>
+                <w:sz w:val="18"/>
+                <w:szCs w:val="18"/>
+              </w:rPr>
+              <w:t xml:space="preserve">2S LiPo; microcontroller on its own regulator</w:t>
             </w:r>
           </w:p>
         </w:tc>
@@ -21944,57 +22791,57 @@
         </w:trPr>
         <w:tc>
           <w:tcPr>
-            <w:tcW w:type="dxa" w:w="518"/>
-            <w:tcMar>
-              <w:top w:type="dxa" w:w="60"/>
-              <w:left w:type="dxa" w:w="90"/>
-              <w:bottom w:type="dxa" w:w="60"/>
-              <w:right w:type="dxa" w:w="90"/>
-            </w:tcMar>
-          </w:tcPr>
-          <w:p>
-            <w:pPr>
-              <w:spacing w:after="0" w:line="252"/>
-            </w:pPr>
-            <w:r>
-              <w:rPr>
-                <w:rFonts w:ascii="Calibri" w:cs="Calibri" w:eastAsia="Calibri" w:hAnsi="Calibri"/>
-                <w:color w:val="1E293B"/>
-                <w:sz w:val="18"/>
-                <w:szCs w:val="18"/>
-              </w:rPr>
-              <w:t xml:space="preserve">H6</w:t>
-            </w:r>
-          </w:p>
-        </w:tc>
-        <w:tc>
-          <w:tcPr>
-            <w:tcW w:type="dxa" w:w="3460"/>
-            <w:tcMar>
-              <w:top w:type="dxa" w:w="60"/>
-              <w:left w:type="dxa" w:w="90"/>
-              <w:bottom w:type="dxa" w:w="60"/>
-              <w:right w:type="dxa" w:w="90"/>
-            </w:tcMar>
-          </w:tcPr>
-          <w:p>
-            <w:pPr>
-              <w:spacing w:after="0" w:line="252"/>
-            </w:pPr>
-            <w:r>
-              <w:rPr>
-                <w:rFonts w:ascii="Calibri" w:cs="Calibri" w:eastAsia="Calibri" w:hAnsi="Calibri"/>
-                <w:color w:val="1E293B"/>
-                <w:sz w:val="18"/>
-                <w:szCs w:val="18"/>
-              </w:rPr>
-              <w:t xml:space="preserve">Remote control: RC transmitter or phone app</w:t>
-            </w:r>
-          </w:p>
-        </w:tc>
-        <w:tc>
-          <w:tcPr>
-            <w:tcW w:type="dxa" w:w="1269"/>
+            <w:tcW w:type="dxa" w:w="517"/>
+            <w:tcMar>
+              <w:top w:type="dxa" w:w="60"/>
+              <w:left w:type="dxa" w:w="90"/>
+              <w:bottom w:type="dxa" w:w="60"/>
+              <w:right w:type="dxa" w:w="90"/>
+            </w:tcMar>
+          </w:tcPr>
+          <w:p>
+            <w:pPr>
+              <w:spacing w:after="0" w:line="252"/>
+            </w:pPr>
+            <w:r>
+              <w:rPr>
+                <w:rFonts w:ascii="Calibri" w:cs="Calibri" w:eastAsia="Calibri" w:hAnsi="Calibri"/>
+                <w:color w:val="1E293B"/>
+                <w:sz w:val="18"/>
+                <w:szCs w:val="18"/>
+              </w:rPr>
+              <w:t xml:space="preserve">H5</w:t>
+            </w:r>
+          </w:p>
+        </w:tc>
+        <w:tc>
+          <w:tcPr>
+            <w:tcW w:type="dxa" w:w="3467"/>
+            <w:tcMar>
+              <w:top w:type="dxa" w:w="60"/>
+              <w:left w:type="dxa" w:w="90"/>
+              <w:bottom w:type="dxa" w:w="60"/>
+              <w:right w:type="dxa" w:w="90"/>
+            </w:tcMar>
+          </w:tcPr>
+          <w:p>
+            <w:pPr>
+              <w:spacing w:after="0" w:line="252"/>
+            </w:pPr>
+            <w:r>
+              <w:rPr>
+                <w:rFonts w:ascii="Calibri" w:cs="Calibri" w:eastAsia="Calibri" w:hAnsi="Calibri"/>
+                <w:color w:val="1E293B"/>
+                <w:sz w:val="18"/>
+                <w:szCs w:val="18"/>
+              </w:rPr>
+              <w:t xml:space="preserve">Real top speed and steering limit of the chosen car</w:t>
+            </w:r>
+          </w:p>
+        </w:tc>
+        <w:tc>
+          <w:tcPr>
+            <w:tcW w:type="dxa" w:w="1265"/>
             <w:tcMar>
               <w:top w:type="dxa" w:w="60"/>
               <w:left w:type="dxa" w:w="90"/>
@@ -22019,7 +22866,7 @@
         </w:tc>
         <w:tc>
           <w:tcPr>
-            <w:tcW w:type="dxa" w:w="1517"/>
+            <w:tcW w:type="dxa" w:w="1514"/>
             <w:tcMar>
               <w:top w:type="dxa" w:w="60"/>
               <w:left w:type="dxa" w:w="90"/>
@@ -22044,26 +22891,26 @@
         </w:tc>
         <w:tc>
           <w:tcPr>
-            <w:tcW w:type="dxa" w:w="2596"/>
-            <w:tcMar>
-              <w:top w:type="dxa" w:w="60"/>
-              <w:left w:type="dxa" w:w="90"/>
-              <w:bottom w:type="dxa" w:w="60"/>
-              <w:right w:type="dxa" w:w="90"/>
-            </w:tcMar>
-          </w:tcPr>
-          <w:p>
-            <w:pPr>
-              <w:spacing w:after="0" w:line="252"/>
-            </w:pPr>
-            <w:r>
-              <w:rPr>
-                <w:rFonts w:ascii="Calibri" w:cs="Calibri" w:eastAsia="Calibri" w:hAnsi="Calibri"/>
-                <w:color w:val="1E293B"/>
-                <w:sz w:val="18"/>
-                <w:szCs w:val="18"/>
-              </w:rPr>
-              <w:t xml:space="preserve">Either; link-loss timeout 0.5 s</w:t>
+            <w:tcW w:type="dxa" w:w="2597"/>
+            <w:tcMar>
+              <w:top w:type="dxa" w:w="60"/>
+              <w:left w:type="dxa" w:w="90"/>
+              <w:bottom w:type="dxa" w:w="60"/>
+              <w:right w:type="dxa" w:w="90"/>
+            </w:tcMar>
+          </w:tcPr>
+          <w:p>
+            <w:pPr>
+              <w:spacing w:after="0" w:line="252"/>
+            </w:pPr>
+            <w:r>
+              <w:rPr>
+                <w:rFonts w:ascii="Calibri" w:cs="Calibri" w:eastAsia="Calibri" w:hAnsi="Calibri"/>
+                <w:color w:val="1E293B"/>
+                <w:sz w:val="18"/>
+                <w:szCs w:val="18"/>
+              </w:rPr>
+              <w:t xml:space="preserve">3.5 m/s, ±25° (and a 1.0 m/s cap for early tests)</w:t>
             </w:r>
           </w:p>
         </w:tc>
@@ -22074,57 +22921,57 @@
         </w:trPr>
         <w:tc>
           <w:tcPr>
-            <w:tcW w:type="dxa" w:w="518"/>
-            <w:tcMar>
-              <w:top w:type="dxa" w:w="60"/>
-              <w:left w:type="dxa" w:w="90"/>
-              <w:bottom w:type="dxa" w:w="60"/>
-              <w:right w:type="dxa" w:w="90"/>
-            </w:tcMar>
-          </w:tcPr>
-          <w:p>
-            <w:pPr>
-              <w:spacing w:after="0" w:line="252"/>
-            </w:pPr>
-            <w:r>
-              <w:rPr>
-                <w:rFonts w:ascii="Calibri" w:cs="Calibri" w:eastAsia="Calibri" w:hAnsi="Calibri"/>
-                <w:color w:val="1E293B"/>
-                <w:sz w:val="18"/>
-                <w:szCs w:val="18"/>
-              </w:rPr>
-              <w:t xml:space="preserve">H7</w:t>
-            </w:r>
-          </w:p>
-        </w:tc>
-        <w:tc>
-          <w:tcPr>
-            <w:tcW w:type="dxa" w:w="3460"/>
-            <w:tcMar>
-              <w:top w:type="dxa" w:w="60"/>
-              <w:left w:type="dxa" w:w="90"/>
-              <w:bottom w:type="dxa" w:w="60"/>
-              <w:right w:type="dxa" w:w="90"/>
-            </w:tcMar>
-          </w:tcPr>
-          <w:p>
-            <w:pPr>
-              <w:spacing w:after="0" w:line="252"/>
-            </w:pPr>
-            <w:r>
-              <w:rPr>
-                <w:rFonts w:ascii="Calibri" w:cs="Calibri" w:eastAsia="Calibri" w:hAnsi="Calibri"/>
-                <w:color w:val="1E293B"/>
-                <w:sz w:val="18"/>
-                <w:szCs w:val="18"/>
-              </w:rPr>
-              <w:t xml:space="preserve">Can the ESC or servo report faults (bits 2 and 3)?</w:t>
-            </w:r>
-          </w:p>
-        </w:tc>
-        <w:tc>
-          <w:tcPr>
-            <w:tcW w:type="dxa" w:w="1269"/>
+            <w:tcW w:type="dxa" w:w="517"/>
+            <w:tcMar>
+              <w:top w:type="dxa" w:w="60"/>
+              <w:left w:type="dxa" w:w="90"/>
+              <w:bottom w:type="dxa" w:w="60"/>
+              <w:right w:type="dxa" w:w="90"/>
+            </w:tcMar>
+          </w:tcPr>
+          <w:p>
+            <w:pPr>
+              <w:spacing w:after="0" w:line="252"/>
+            </w:pPr>
+            <w:r>
+              <w:rPr>
+                <w:rFonts w:ascii="Calibri" w:cs="Calibri" w:eastAsia="Calibri" w:hAnsi="Calibri"/>
+                <w:color w:val="1E293B"/>
+                <w:sz w:val="18"/>
+                <w:szCs w:val="18"/>
+              </w:rPr>
+              <w:t xml:space="preserve">H6</w:t>
+            </w:r>
+          </w:p>
+        </w:tc>
+        <w:tc>
+          <w:tcPr>
+            <w:tcW w:type="dxa" w:w="3467"/>
+            <w:tcMar>
+              <w:top w:type="dxa" w:w="60"/>
+              <w:left w:type="dxa" w:w="90"/>
+              <w:bottom w:type="dxa" w:w="60"/>
+              <w:right w:type="dxa" w:w="90"/>
+            </w:tcMar>
+          </w:tcPr>
+          <w:p>
+            <w:pPr>
+              <w:spacing w:after="0" w:line="252"/>
+            </w:pPr>
+            <w:r>
+              <w:rPr>
+                <w:rFonts w:ascii="Calibri" w:cs="Calibri" w:eastAsia="Calibri" w:hAnsi="Calibri"/>
+                <w:color w:val="1E293B"/>
+                <w:sz w:val="18"/>
+                <w:szCs w:val="18"/>
+              </w:rPr>
+              <w:t xml:space="preserve">Remote control: RC transmitter or phone app</w:t>
+            </w:r>
+          </w:p>
+        </w:tc>
+        <w:tc>
+          <w:tcPr>
+            <w:tcW w:type="dxa" w:w="1265"/>
             <w:tcMar>
               <w:top w:type="dxa" w:w="60"/>
               <w:left w:type="dxa" w:w="90"/>
@@ -22149,51 +22996,51 @@
         </w:tc>
         <w:tc>
           <w:tcPr>
-            <w:tcW w:type="dxa" w:w="1517"/>
-            <w:tcMar>
-              <w:top w:type="dxa" w:w="60"/>
-              <w:left w:type="dxa" w:w="90"/>
-              <w:bottom w:type="dxa" w:w="60"/>
-              <w:right w:type="dxa" w:w="90"/>
-            </w:tcMar>
-          </w:tcPr>
-          <w:p>
-            <w:pPr>
-              <w:spacing w:after="0" w:line="252"/>
-            </w:pPr>
-            <w:r>
-              <w:rPr>
-                <w:rFonts w:ascii="Calibri" w:cs="Calibri" w:eastAsia="Calibri" w:hAnsi="Calibri"/>
-                <w:color w:val="1E293B"/>
-                <w:sz w:val="18"/>
-                <w:szCs w:val="18"/>
-              </w:rPr>
-              <w:t xml:space="preserve">—</w:t>
-            </w:r>
-          </w:p>
-        </w:tc>
-        <w:tc>
-          <w:tcPr>
-            <w:tcW w:type="dxa" w:w="2596"/>
-            <w:tcMar>
-              <w:top w:type="dxa" w:w="60"/>
-              <w:left w:type="dxa" w:w="90"/>
-              <w:bottom w:type="dxa" w:w="60"/>
-              <w:right w:type="dxa" w:w="90"/>
-            </w:tcMar>
-          </w:tcPr>
-          <w:p>
-            <w:pPr>
-              <w:spacing w:after="0" w:line="252"/>
-            </w:pPr>
-            <w:r>
-              <w:rPr>
-                <w:rFonts w:ascii="Calibri" w:cs="Calibri" w:eastAsia="Calibri" w:hAnsi="Calibri"/>
-                <w:color w:val="1E293B"/>
-                <w:sz w:val="18"/>
-                <w:szCs w:val="18"/>
-              </w:rPr>
-              <w:t xml:space="preserve">Assume not; bits stay 0</w:t>
+            <w:tcW w:type="dxa" w:w="1514"/>
+            <w:tcMar>
+              <w:top w:type="dxa" w:w="60"/>
+              <w:left w:type="dxa" w:w="90"/>
+              <w:bottom w:type="dxa" w:w="60"/>
+              <w:right w:type="dxa" w:w="90"/>
+            </w:tcMar>
+          </w:tcPr>
+          <w:p>
+            <w:pPr>
+              <w:spacing w:after="0" w:line="252"/>
+            </w:pPr>
+            <w:r>
+              <w:rPr>
+                <w:rFonts w:ascii="Calibri" w:cs="Calibri" w:eastAsia="Calibri" w:hAnsi="Calibri"/>
+                <w:color w:val="1E293B"/>
+                <w:sz w:val="18"/>
+                <w:szCs w:val="18"/>
+              </w:rPr>
+              <w:t xml:space="preserve">AVC</w:t>
+            </w:r>
+          </w:p>
+        </w:tc>
+        <w:tc>
+          <w:tcPr>
+            <w:tcW w:type="dxa" w:w="2597"/>
+            <w:tcMar>
+              <w:top w:type="dxa" w:w="60"/>
+              <w:left w:type="dxa" w:w="90"/>
+              <w:bottom w:type="dxa" w:w="60"/>
+              <w:right w:type="dxa" w:w="90"/>
+            </w:tcMar>
+          </w:tcPr>
+          <w:p>
+            <w:pPr>
+              <w:spacing w:after="0" w:line="252"/>
+            </w:pPr>
+            <w:r>
+              <w:rPr>
+                <w:rFonts w:ascii="Calibri" w:cs="Calibri" w:eastAsia="Calibri" w:hAnsi="Calibri"/>
+                <w:color w:val="1E293B"/>
+                <w:sz w:val="18"/>
+                <w:szCs w:val="18"/>
+              </w:rPr>
+              <w:t xml:space="preserve">Either; link-loss timeout 0.5 s</w:t>
             </w:r>
           </w:p>
         </w:tc>
@@ -22204,57 +23051,57 @@
         </w:trPr>
         <w:tc>
           <w:tcPr>
-            <w:tcW w:type="dxa" w:w="518"/>
-            <w:tcMar>
-              <w:top w:type="dxa" w:w="60"/>
-              <w:left w:type="dxa" w:w="90"/>
-              <w:bottom w:type="dxa" w:w="60"/>
-              <w:right w:type="dxa" w:w="90"/>
-            </w:tcMar>
-          </w:tcPr>
-          <w:p>
-            <w:pPr>
-              <w:spacing w:after="0" w:line="252"/>
-            </w:pPr>
-            <w:r>
-              <w:rPr>
-                <w:rFonts w:ascii="Calibri" w:cs="Calibri" w:eastAsia="Calibri" w:hAnsi="Calibri"/>
-                <w:color w:val="1E293B"/>
-                <w:sz w:val="18"/>
-                <w:szCs w:val="18"/>
-              </w:rPr>
-              <w:t xml:space="preserve">H8</w:t>
-            </w:r>
-          </w:p>
-        </w:tc>
-        <w:tc>
-          <w:tcPr>
-            <w:tcW w:type="dxa" w:w="3460"/>
-            <w:tcMar>
-              <w:top w:type="dxa" w:w="60"/>
-              <w:left w:type="dxa" w:w="90"/>
-              <w:bottom w:type="dxa" w:w="60"/>
-              <w:right w:type="dxa" w:w="90"/>
-            </w:tcMar>
-          </w:tcPr>
-          <w:p>
-            <w:pPr>
-              <w:spacing w:after="0" w:line="252"/>
-            </w:pPr>
-            <w:r>
-              <w:rPr>
-                <w:rFonts w:ascii="Calibri" w:cs="Calibri" w:eastAsia="Calibri" w:hAnsi="Calibri"/>
-                <w:color w:val="1E293B"/>
-                <w:sz w:val="18"/>
-                <w:szCs w:val="18"/>
-              </w:rPr>
-              <w:t xml:space="preserve">How does our ESC brake (below-neutral pulse = brake or reverse?), and what does it do when its signal stops?</w:t>
-            </w:r>
-          </w:p>
-        </w:tc>
-        <w:tc>
-          <w:tcPr>
-            <w:tcW w:type="dxa" w:w="1269"/>
+            <w:tcW w:type="dxa" w:w="517"/>
+            <w:tcMar>
+              <w:top w:type="dxa" w:w="60"/>
+              <w:left w:type="dxa" w:w="90"/>
+              <w:bottom w:type="dxa" w:w="60"/>
+              <w:right w:type="dxa" w:w="90"/>
+            </w:tcMar>
+          </w:tcPr>
+          <w:p>
+            <w:pPr>
+              <w:spacing w:after="0" w:line="252"/>
+            </w:pPr>
+            <w:r>
+              <w:rPr>
+                <w:rFonts w:ascii="Calibri" w:cs="Calibri" w:eastAsia="Calibri" w:hAnsi="Calibri"/>
+                <w:color w:val="1E293B"/>
+                <w:sz w:val="18"/>
+                <w:szCs w:val="18"/>
+              </w:rPr>
+              <w:t xml:space="preserve">H7</w:t>
+            </w:r>
+          </w:p>
+        </w:tc>
+        <w:tc>
+          <w:tcPr>
+            <w:tcW w:type="dxa" w:w="3467"/>
+            <w:tcMar>
+              <w:top w:type="dxa" w:w="60"/>
+              <w:left w:type="dxa" w:w="90"/>
+              <w:bottom w:type="dxa" w:w="60"/>
+              <w:right w:type="dxa" w:w="90"/>
+            </w:tcMar>
+          </w:tcPr>
+          <w:p>
+            <w:pPr>
+              <w:spacing w:after="0" w:line="252"/>
+            </w:pPr>
+            <w:r>
+              <w:rPr>
+                <w:rFonts w:ascii="Calibri" w:cs="Calibri" w:eastAsia="Calibri" w:hAnsi="Calibri"/>
+                <w:color w:val="1E293B"/>
+                <w:sz w:val="18"/>
+                <w:szCs w:val="18"/>
+              </w:rPr>
+              <w:t xml:space="preserve">Can the ESC or servo report faults (bits 2 and 3)?</w:t>
+            </w:r>
+          </w:p>
+        </w:tc>
+        <w:tc>
+          <w:tcPr>
+            <w:tcW w:type="dxa" w:w="1265"/>
             <w:tcMar>
               <w:top w:type="dxa" w:w="60"/>
               <w:left w:type="dxa" w:w="90"/>
@@ -22279,51 +23126,51 @@
         </w:tc>
         <w:tc>
           <w:tcPr>
-            <w:tcW w:type="dxa" w:w="1517"/>
-            <w:tcMar>
-              <w:top w:type="dxa" w:w="60"/>
-              <w:left w:type="dxa" w:w="90"/>
-              <w:bottom w:type="dxa" w:w="60"/>
-              <w:right w:type="dxa" w:w="90"/>
-            </w:tcMar>
-          </w:tcPr>
-          <w:p>
-            <w:pPr>
-              <w:spacing w:after="0" w:line="252"/>
-            </w:pPr>
-            <w:r>
-              <w:rPr>
-                <w:rFonts w:ascii="Calibri" w:cs="Calibri" w:eastAsia="Calibri" w:hAnsi="Calibri"/>
-                <w:color w:val="1E293B"/>
-                <w:sz w:val="18"/>
-                <w:szCs w:val="18"/>
-              </w:rPr>
-              <w:t xml:space="preserve">ESC manual / Test 3</w:t>
-            </w:r>
-          </w:p>
-        </w:tc>
-        <w:tc>
-          <w:tcPr>
-            <w:tcW w:type="dxa" w:w="2596"/>
-            <w:tcMar>
-              <w:top w:type="dxa" w:w="60"/>
-              <w:left w:type="dxa" w:w="90"/>
-              <w:bottom w:type="dxa" w:w="60"/>
-              <w:right w:type="dxa" w:w="90"/>
-            </w:tcMar>
-          </w:tcPr>
-          <w:p>
-            <w:pPr>
-              <w:spacing w:after="0" w:line="252"/>
-            </w:pPr>
-            <w:r>
-              <w:rPr>
-                <w:rFonts w:ascii="Calibri" w:cs="Calibri" w:eastAsia="Calibri" w:hAnsi="Calibri"/>
-                <w:color w:val="1E293B"/>
-                <w:sz w:val="18"/>
-                <w:szCs w:val="18"/>
-              </w:rPr>
-              <w:t xml:space="preserve">Command neutral; assume the ESC goes neutral on signal loss until tested</w:t>
+            <w:tcW w:type="dxa" w:w="1514"/>
+            <w:tcMar>
+              <w:top w:type="dxa" w:w="60"/>
+              <w:left w:type="dxa" w:w="90"/>
+              <w:bottom w:type="dxa" w:w="60"/>
+              <w:right w:type="dxa" w:w="90"/>
+            </w:tcMar>
+          </w:tcPr>
+          <w:p>
+            <w:pPr>
+              <w:spacing w:after="0" w:line="252"/>
+            </w:pPr>
+            <w:r>
+              <w:rPr>
+                <w:rFonts w:ascii="Calibri" w:cs="Calibri" w:eastAsia="Calibri" w:hAnsi="Calibri"/>
+                <w:color w:val="1E293B"/>
+                <w:sz w:val="18"/>
+                <w:szCs w:val="18"/>
+              </w:rPr>
+              <w:t xml:space="preserve">—</w:t>
+            </w:r>
+          </w:p>
+        </w:tc>
+        <w:tc>
+          <w:tcPr>
+            <w:tcW w:type="dxa" w:w="2597"/>
+            <w:tcMar>
+              <w:top w:type="dxa" w:w="60"/>
+              <w:left w:type="dxa" w:w="90"/>
+              <w:bottom w:type="dxa" w:w="60"/>
+              <w:right w:type="dxa" w:w="90"/>
+            </w:tcMar>
+          </w:tcPr>
+          <w:p>
+            <w:pPr>
+              <w:spacing w:after="0" w:line="252"/>
+            </w:pPr>
+            <w:r>
+              <w:rPr>
+                <w:rFonts w:ascii="Calibri" w:cs="Calibri" w:eastAsia="Calibri" w:hAnsi="Calibri"/>
+                <w:color w:val="1E293B"/>
+                <w:sz w:val="18"/>
+                <w:szCs w:val="18"/>
+              </w:rPr>
+              <w:t xml:space="preserve">Assume not; bits stay 0</w:t>
             </w:r>
           </w:p>
         </w:tc>
@@ -22334,126 +23181,126 @@
         </w:trPr>
         <w:tc>
           <w:tcPr>
-            <w:tcW w:type="dxa" w:w="518"/>
-            <w:tcMar>
-              <w:top w:type="dxa" w:w="60"/>
-              <w:left w:type="dxa" w:w="90"/>
-              <w:bottom w:type="dxa" w:w="60"/>
-              <w:right w:type="dxa" w:w="90"/>
-            </w:tcMar>
-          </w:tcPr>
-          <w:p>
-            <w:pPr>
-              <w:spacing w:after="0" w:line="252"/>
-            </w:pPr>
-            <w:r>
-              <w:rPr>
-                <w:rFonts w:ascii="Calibri" w:cs="Calibri" w:eastAsia="Calibri" w:hAnsi="Calibri"/>
-                <w:color w:val="1E293B"/>
-                <w:sz w:val="18"/>
-                <w:szCs w:val="18"/>
-              </w:rPr>
-              <w:t xml:space="preserve">I1</w:t>
-            </w:r>
-          </w:p>
-        </w:tc>
-        <w:tc>
-          <w:tcPr>
-            <w:tcW w:type="dxa" w:w="3460"/>
-            <w:tcMar>
-              <w:top w:type="dxa" w:w="60"/>
-              <w:left w:type="dxa" w:w="90"/>
-              <w:bottom w:type="dxa" w:w="60"/>
-              <w:right w:type="dxa" w:w="90"/>
-            </w:tcMar>
-          </w:tcPr>
-          <w:p>
-            <w:pPr>
-              <w:spacing w:after="0" w:line="252"/>
-            </w:pPr>
-            <w:r>
-              <w:rPr>
-                <w:rFonts w:ascii="Calibri" w:cs="Calibri" w:eastAsia="Calibri" w:hAnsi="Calibri"/>
-                <w:color w:val="1E293B"/>
-                <w:sz w:val="18"/>
-                <w:szCs w:val="18"/>
-              </w:rPr>
-              <w:t xml:space="preserve">How the signals physically travel between teams (one Simulink model, serial, Wi-Fi)</w:t>
-            </w:r>
-          </w:p>
-        </w:tc>
-        <w:tc>
-          <w:tcPr>
-            <w:tcW w:type="dxa" w:w="1269"/>
-            <w:tcMar>
-              <w:top w:type="dxa" w:w="60"/>
-              <w:left w:type="dxa" w:w="90"/>
-              <w:bottom w:type="dxa" w:w="60"/>
-              <w:right w:type="dxa" w:w="90"/>
-            </w:tcMar>
-          </w:tcPr>
-          <w:p>
-            <w:pPr>
-              <w:spacing w:after="0" w:line="252"/>
-            </w:pPr>
-            <w:r>
-              <w:rPr>
-                <w:rFonts w:ascii="Calibri" w:cs="Calibri" w:eastAsia="Calibri" w:hAnsi="Calibri"/>
-                <w:color w:val="1E293B"/>
-                <w:sz w:val="18"/>
-                <w:szCs w:val="18"/>
-              </w:rPr>
-              <w:t xml:space="preserve">Jessica</w:t>
-            </w:r>
-          </w:p>
-        </w:tc>
-        <w:tc>
-          <w:tcPr>
-            <w:tcW w:type="dxa" w:w="1517"/>
-            <w:tcMar>
-              <w:top w:type="dxa" w:w="60"/>
-              <w:left w:type="dxa" w:w="90"/>
-              <w:bottom w:type="dxa" w:w="60"/>
-              <w:right w:type="dxa" w:w="90"/>
-            </w:tcMar>
-          </w:tcPr>
-          <w:p>
-            <w:pPr>
-              <w:spacing w:after="0" w:line="252"/>
-            </w:pPr>
-            <w:r>
-              <w:rPr>
-                <w:rFonts w:ascii="Calibri" w:cs="Calibri" w:eastAsia="Calibri" w:hAnsi="Calibri"/>
-                <w:color w:val="1E293B"/>
-                <w:sz w:val="18"/>
-                <w:szCs w:val="18"/>
-              </w:rPr>
-              <w:t xml:space="preserve">All teams</w:t>
-            </w:r>
-          </w:p>
-        </w:tc>
-        <w:tc>
-          <w:tcPr>
-            <w:tcW w:type="dxa" w:w="2596"/>
-            <w:tcMar>
-              <w:top w:type="dxa" w:w="60"/>
-              <w:left w:type="dxa" w:w="90"/>
-              <w:bottom w:type="dxa" w:w="60"/>
-              <w:right w:type="dxa" w:w="90"/>
-            </w:tcMar>
-          </w:tcPr>
-          <w:p>
-            <w:pPr>
-              <w:spacing w:after="0" w:line="252"/>
-            </w:pPr>
-            <w:r>
-              <w:rPr>
-                <w:rFonts w:ascii="Calibri" w:cs="Calibri" w:eastAsia="Calibri" w:hAnsi="Calibri"/>
-                <w:color w:val="1E293B"/>
-                <w:sz w:val="18"/>
-                <w:szCs w:val="18"/>
-              </w:rPr>
-              <w:t xml:space="preserve">Decide at Milestone 2</w:t>
+            <w:tcW w:type="dxa" w:w="517"/>
+            <w:tcMar>
+              <w:top w:type="dxa" w:w="60"/>
+              <w:left w:type="dxa" w:w="90"/>
+              <w:bottom w:type="dxa" w:w="60"/>
+              <w:right w:type="dxa" w:w="90"/>
+            </w:tcMar>
+          </w:tcPr>
+          <w:p>
+            <w:pPr>
+              <w:spacing w:after="0" w:line="252"/>
+            </w:pPr>
+            <w:r>
+              <w:rPr>
+                <w:rFonts w:ascii="Calibri" w:cs="Calibri" w:eastAsia="Calibri" w:hAnsi="Calibri"/>
+                <w:color w:val="1E293B"/>
+                <w:sz w:val="18"/>
+                <w:szCs w:val="18"/>
+              </w:rPr>
+              <w:t xml:space="preserve">H8</w:t>
+            </w:r>
+          </w:p>
+        </w:tc>
+        <w:tc>
+          <w:tcPr>
+            <w:tcW w:type="dxa" w:w="3467"/>
+            <w:tcMar>
+              <w:top w:type="dxa" w:w="60"/>
+              <w:left w:type="dxa" w:w="90"/>
+              <w:bottom w:type="dxa" w:w="60"/>
+              <w:right w:type="dxa" w:w="90"/>
+            </w:tcMar>
+          </w:tcPr>
+          <w:p>
+            <w:pPr>
+              <w:spacing w:after="0" w:line="252"/>
+            </w:pPr>
+            <w:r>
+              <w:rPr>
+                <w:rFonts w:ascii="Calibri" w:cs="Calibri" w:eastAsia="Calibri" w:hAnsi="Calibri"/>
+                <w:color w:val="1E293B"/>
+                <w:sz w:val="18"/>
+                <w:szCs w:val="18"/>
+              </w:rPr>
+              <w:t xml:space="preserve">How does our ESC brake (below-neutral pulse = brake or reverse?), and what does it do when its signal stops?</w:t>
+            </w:r>
+          </w:p>
+        </w:tc>
+        <w:tc>
+          <w:tcPr>
+            <w:tcW w:type="dxa" w:w="1265"/>
+            <w:tcMar>
+              <w:top w:type="dxa" w:w="60"/>
+              <w:left w:type="dxa" w:w="90"/>
+              <w:bottom w:type="dxa" w:w="60"/>
+              <w:right w:type="dxa" w:w="90"/>
+            </w:tcMar>
+          </w:tcPr>
+          <w:p>
+            <w:pPr>
+              <w:spacing w:after="0" w:line="252"/>
+            </w:pPr>
+            <w:r>
+              <w:rPr>
+                <w:rFonts w:ascii="Calibri" w:cs="Calibri" w:eastAsia="Calibri" w:hAnsi="Calibri"/>
+                <w:color w:val="1E293B"/>
+                <w:sz w:val="18"/>
+                <w:szCs w:val="18"/>
+              </w:rPr>
+              <w:t xml:space="preserve">Colin</w:t>
+            </w:r>
+          </w:p>
+        </w:tc>
+        <w:tc>
+          <w:tcPr>
+            <w:tcW w:type="dxa" w:w="1514"/>
+            <w:tcMar>
+              <w:top w:type="dxa" w:w="60"/>
+              <w:left w:type="dxa" w:w="90"/>
+              <w:bottom w:type="dxa" w:w="60"/>
+              <w:right w:type="dxa" w:w="90"/>
+            </w:tcMar>
+          </w:tcPr>
+          <w:p>
+            <w:pPr>
+              <w:spacing w:after="0" w:line="252"/>
+            </w:pPr>
+            <w:r>
+              <w:rPr>
+                <w:rFonts w:ascii="Calibri" w:cs="Calibri" w:eastAsia="Calibri" w:hAnsi="Calibri"/>
+                <w:color w:val="1E293B"/>
+                <w:sz w:val="18"/>
+                <w:szCs w:val="18"/>
+              </w:rPr>
+              <w:t xml:space="preserve">ESC manual / Test 3</w:t>
+            </w:r>
+          </w:p>
+        </w:tc>
+        <w:tc>
+          <w:tcPr>
+            <w:tcW w:type="dxa" w:w="2597"/>
+            <w:tcMar>
+              <w:top w:type="dxa" w:w="60"/>
+              <w:left w:type="dxa" w:w="90"/>
+              <w:bottom w:type="dxa" w:w="60"/>
+              <w:right w:type="dxa" w:w="90"/>
+            </w:tcMar>
+          </w:tcPr>
+          <w:p>
+            <w:pPr>
+              <w:spacing w:after="0" w:line="252"/>
+            </w:pPr>
+            <w:r>
+              <w:rPr>
+                <w:rFonts w:ascii="Calibri" w:cs="Calibri" w:eastAsia="Calibri" w:hAnsi="Calibri"/>
+                <w:color w:val="1E293B"/>
+                <w:sz w:val="18"/>
+                <w:szCs w:val="18"/>
+              </w:rPr>
+              <w:t xml:space="preserve">Command neutral; assume the ESC goes neutral on signal loss until tested</w:t>
             </w:r>
           </w:p>
         </w:tc>
@@ -22464,7 +23311,137 @@
         </w:trPr>
         <w:tc>
           <w:tcPr>
-            <w:tcW w:type="dxa" w:w="518"/>
+            <w:tcW w:type="dxa" w:w="517"/>
+            <w:tcMar>
+              <w:top w:type="dxa" w:w="60"/>
+              <w:left w:type="dxa" w:w="90"/>
+              <w:bottom w:type="dxa" w:w="60"/>
+              <w:right w:type="dxa" w:w="90"/>
+            </w:tcMar>
+          </w:tcPr>
+          <w:p>
+            <w:pPr>
+              <w:spacing w:after="0" w:line="252"/>
+            </w:pPr>
+            <w:r>
+              <w:rPr>
+                <w:rFonts w:ascii="Calibri" w:cs="Calibri" w:eastAsia="Calibri" w:hAnsi="Calibri"/>
+                <w:color w:val="1E293B"/>
+                <w:sz w:val="18"/>
+                <w:szCs w:val="18"/>
+              </w:rPr>
+              <w:t xml:space="preserve">I1</w:t>
+            </w:r>
+          </w:p>
+        </w:tc>
+        <w:tc>
+          <w:tcPr>
+            <w:tcW w:type="dxa" w:w="3467"/>
+            <w:tcMar>
+              <w:top w:type="dxa" w:w="60"/>
+              <w:left w:type="dxa" w:w="90"/>
+              <w:bottom w:type="dxa" w:w="60"/>
+              <w:right w:type="dxa" w:w="90"/>
+            </w:tcMar>
+          </w:tcPr>
+          <w:p>
+            <w:pPr>
+              <w:spacing w:after="0" w:line="252"/>
+            </w:pPr>
+            <w:r>
+              <w:rPr>
+                <w:rFonts w:ascii="Calibri" w:cs="Calibri" w:eastAsia="Calibri" w:hAnsi="Calibri"/>
+                <w:color w:val="1E293B"/>
+                <w:sz w:val="18"/>
+                <w:szCs w:val="18"/>
+              </w:rPr>
+              <w:t xml:space="preserve">How the signals physically travel between teams (one Simulink model, serial, Wi-Fi)</w:t>
+            </w:r>
+          </w:p>
+        </w:tc>
+        <w:tc>
+          <w:tcPr>
+            <w:tcW w:type="dxa" w:w="1265"/>
+            <w:tcMar>
+              <w:top w:type="dxa" w:w="60"/>
+              <w:left w:type="dxa" w:w="90"/>
+              <w:bottom w:type="dxa" w:w="60"/>
+              <w:right w:type="dxa" w:w="90"/>
+            </w:tcMar>
+          </w:tcPr>
+          <w:p>
+            <w:pPr>
+              <w:spacing w:after="0" w:line="252"/>
+            </w:pPr>
+            <w:r>
+              <w:rPr>
+                <w:rFonts w:ascii="Calibri" w:cs="Calibri" w:eastAsia="Calibri" w:hAnsi="Calibri"/>
+                <w:color w:val="1E293B"/>
+                <w:sz w:val="18"/>
+                <w:szCs w:val="18"/>
+              </w:rPr>
+              <w:t xml:space="preserve">Jessica</w:t>
+            </w:r>
+          </w:p>
+        </w:tc>
+        <w:tc>
+          <w:tcPr>
+            <w:tcW w:type="dxa" w:w="1514"/>
+            <w:tcMar>
+              <w:top w:type="dxa" w:w="60"/>
+              <w:left w:type="dxa" w:w="90"/>
+              <w:bottom w:type="dxa" w:w="60"/>
+              <w:right w:type="dxa" w:w="90"/>
+            </w:tcMar>
+          </w:tcPr>
+          <w:p>
+            <w:pPr>
+              <w:spacing w:after="0" w:line="252"/>
+            </w:pPr>
+            <w:r>
+              <w:rPr>
+                <w:rFonts w:ascii="Calibri" w:cs="Calibri" w:eastAsia="Calibri" w:hAnsi="Calibri"/>
+                <w:color w:val="1E293B"/>
+                <w:sz w:val="18"/>
+                <w:szCs w:val="18"/>
+              </w:rPr>
+              <w:t xml:space="preserve">All teams</w:t>
+            </w:r>
+          </w:p>
+        </w:tc>
+        <w:tc>
+          <w:tcPr>
+            <w:tcW w:type="dxa" w:w="2597"/>
+            <w:tcMar>
+              <w:top w:type="dxa" w:w="60"/>
+              <w:left w:type="dxa" w:w="90"/>
+              <w:bottom w:type="dxa" w:w="60"/>
+              <w:right w:type="dxa" w:w="90"/>
+            </w:tcMar>
+          </w:tcPr>
+          <w:p>
+            <w:pPr>
+              <w:spacing w:after="0" w:line="252"/>
+            </w:pPr>
+            <w:r>
+              <w:rPr>
+                <w:rFonts w:ascii="Calibri" w:cs="Calibri" w:eastAsia="Calibri" w:hAnsi="Calibri"/>
+                <w:color w:val="1E293B"/>
+                <w:sz w:val="18"/>
+                <w:szCs w:val="18"/>
+              </w:rPr>
+              <w:t xml:space="preserve">Decide at Milestone 2</w:t>
+            </w:r>
+          </w:p>
+        </w:tc>
+      </w:tr>
+      <w:tr>
+        <w:trPr>
+          <w:cantSplit/>
+        </w:trPr>
+        <w:tc>
+          <w:tcPr>
+            <w:tcW w:type="dxa" w:w="517"/>
             <w:tcMar>
               <w:top w:type="dxa" w:w="60"/>
               <w:left w:type="dxa" w:w="90"/>
@@ -22489,7 +23466,7 @@
         </w:tc>
         <w:tc>
           <w:tcPr>
-            <w:tcW w:type="dxa" w:w="3460"/>
+            <w:tcW w:type="dxa" w:w="3467"/>
             <w:tcMar>
               <w:top w:type="dxa" w:w="60"/>
               <w:left w:type="dxa" w:w="90"/>
@@ -22514,7 +23491,7 @@
         </w:tc>
         <w:tc>
           <w:tcPr>
-            <w:tcW w:type="dxa" w:w="1269"/>
+            <w:tcW w:type="dxa" w:w="1265"/>
             <w:tcMar>
               <w:top w:type="dxa" w:w="60"/>
               <w:left w:type="dxa" w:w="90"/>
@@ -22539,7 +23516,7 @@
         </w:tc>
         <w:tc>
           <w:tcPr>
-            <w:tcW w:type="dxa" w:w="1517"/>
+            <w:tcW w:type="dxa" w:w="1514"/>
             <w:tcMar>
               <w:top w:type="dxa" w:w="60"/>
               <w:left w:type="dxa" w:w="90"/>
@@ -22564,7 +23541,7 @@
         </w:tc>
         <w:tc>
           <w:tcPr>
-            <w:tcW w:type="dxa" w:w="2596"/>
+            <w:tcW w:type="dxa" w:w="2597"/>
             <w:tcMar>
               <w:top w:type="dxa" w:w="60"/>
               <w:left w:type="dxa" w:w="90"/>

</xml_diff>